<commit_message>
docs: add Chapter 5 (System Testing) to fyp2_updated.docx with PHPUnit results and UAT table
Agent-Logs-Url: https://github.com/Irfan2807/attendance-app/sessions/04cb1eed-44ec-4629-b17c-aa87bbc36066

Co-authored-by: Irfan2807 <229257174+Irfan2807@users.noreply.github.com>
</commit_message>
<xml_diff>
--- a/docs/fyp2_updated.docx
+++ b/docs/fyp2_updated.docx
@@ -399,7 +399,7 @@
         <w:rPr>
           <w:b w:val="0"/>
         </w:rPr>
-        <w:t>CHAPTER 5    CONCLUSION AND RECOMMENDATIONS FOR FUTURE WORK</w:t>
+        <w:t>CHAPTER 6    CONCLUSION AND RECOMMENDATIONS FOR FUTURE WORK</w:t>
       </w:r>
       <w:r>
         <w:tab/>
@@ -411,7 +411,7 @@
         <w:rPr>
           <w:b w:val="0"/>
         </w:rPr>
-        <w:t>5.1    Conclusion</w:t>
+        <w:t>6.1    Conclusion</w:t>
       </w:r>
       <w:r>
         <w:tab/>
@@ -6230,11 +6230,16 @@
       </w:r>
     </w:p>
     <w:p>
+      <w:r>
+        <w:br w:type="page"/>
+      </w:r>
+    </w:p>
+    <w:p>
       <w:pPr>
         <w:pStyle w:val="Heading1"/>
       </w:pPr>
       <w:r>
-        <w:t>CHAPTER 5    CONCLUSION AND RECOMMENDATIONS FOR FUTURE WORK</w:t>
+        <w:t>CHAPTER 5    SYSTEM TESTING</w:t>
       </w:r>
     </w:p>
     <w:p>
@@ -6242,7 +6247,3747 @@
         <w:pStyle w:val="Heading2"/>
       </w:pPr>
       <w:r>
-        <w:t>5.1  Conclusion</w:t>
+        <w:t>5.1  Introduction to Testing</w:t>
+      </w:r>
+    </w:p>
+    <w:p>
+      <w:pPr/>
+      <w:r>
+        <w:t>System testing is a critical phase of the software development lifecycle that verifies the implemented system meets all specified functional and non-functional requirements. This chapter documents two complementary testing activities carried out on the Attendance &amp; Workforce Operations Platform: (1) automated feature testing executed using the PHPUnit framework, and (2) structured black-box User Acceptance Testing (UAT) performed against predefined test cases derived from the System Requirements Specification in Appendix A.</w:t>
+      </w:r>
+    </w:p>
+    <w:p>
+      <w:pPr>
+        <w:pStyle w:val="Heading2"/>
+      </w:pPr>
+      <w:r>
+        <w:t>5.2  Testing Approach</w:t>
+      </w:r>
+    </w:p>
+    <w:p>
+      <w:pPr/>
+      <w:r>
+        <w:t>The testing strategy adopts a layered approach. Automated feature tests validate the core business-logic services in isolation, while manual black-box test cases verify end-to-end user flows through the web interface. The following testing types were applied:</w:t>
+      </w:r>
+    </w:p>
+    <w:p>
+      <w:pPr>
+        <w:pStyle w:val="ListBullet"/>
+      </w:pPr>
+      <w:r>
+        <w:t>Feature Testing (PHPUnit) — validates service-layer logic including shift-window calculations, stale-shift detection, overtime computation, and role-based widget visibility.</w:t>
+      </w:r>
+    </w:p>
+    <w:p>
+      <w:pPr>
+        <w:pStyle w:val="ListBullet"/>
+      </w:pPr>
+      <w:r>
+        <w:t>Black-Box / User Acceptance Testing — validates UI flows for all three user roles (Staff, Manager, Admin) against expected system behaviour.</w:t>
+      </w:r>
+    </w:p>
+    <w:p>
+      <w:pPr>
+        <w:pStyle w:val="ListBullet"/>
+      </w:pPr>
+      <w:r>
+        <w:t>Boundary Value Analysis — applied to shift hours, overtime thresholds, and GPS radius checks to confirm correct behaviour at edge values.</w:t>
+      </w:r>
+    </w:p>
+    <w:p>
+      <w:pPr/>
+      <w:r>
+        <w:t>The test environment used PHP 8.3.6, Laravel 12, Filament 3.2, PHPUnit 11.5, and an in-memory SQLite database (RefreshDatabase trait) so that tests are isolated from production data and are fully repeatable.</w:t>
+      </w:r>
+    </w:p>
+    <w:p>
+      <w:pPr>
+        <w:pStyle w:val="Heading2"/>
+      </w:pPr>
+      <w:r>
+        <w:t>5.3  Automated Feature Test Results</w:t>
+      </w:r>
+    </w:p>
+    <w:p>
+      <w:pPr/>
+      <w:r>
+        <w:t>Automated feature tests were written for the AttendanceShiftLogicTest class, covering seven test cases across AttendanceWindowService and AttendanceMetricsService, as well as role-based widget visibility in the Filament Staff Panel.</w:t>
+      </w:r>
+    </w:p>
+    <w:p>
+      <w:pPr/>
+      <w:r>
+        <w:t>5.3.1  Test Suite Summary</w:t>
+      </w:r>
+    </w:p>
+    <w:tbl>
+      <w:tblPr>
+        <w:tblStyle w:val="TableGrid"/>
+        <w:tblW w:type="auto" w:w="0"/>
+        <w:tblLook w:firstColumn="1" w:firstRow="1" w:lastColumn="0" w:lastRow="0" w:noHBand="0" w:noVBand="1" w:val="04A0"/>
+      </w:tblPr>
+      <w:tblGrid>
+        <w:gridCol w:w="4320"/>
+        <w:gridCol w:w="4320"/>
+      </w:tblGrid>
+      <w:tr>
+        <w:tc>
+          <w:tcPr>
+            <w:tcW w:type="dxa" w:w="4320"/>
+          </w:tcPr>
+          <w:p>
+            <w:r>
+              <w:rPr>
+                <w:b/>
+              </w:rPr>
+              <w:t>Metric</w:t>
+            </w:r>
+          </w:p>
+        </w:tc>
+        <w:tc>
+          <w:tcPr>
+            <w:tcW w:type="dxa" w:w="4320"/>
+          </w:tcPr>
+          <w:p>
+            <w:r>
+              <w:rPr>
+                <w:b/>
+              </w:rPr>
+              <w:t>Value</w:t>
+            </w:r>
+          </w:p>
+        </w:tc>
+      </w:tr>
+      <w:tr>
+        <w:tc>
+          <w:tcPr>
+            <w:tcW w:type="dxa" w:w="4320"/>
+          </w:tcPr>
+          <w:p/>
+        </w:tc>
+        <w:tc>
+          <w:tcPr>
+            <w:tcW w:type="dxa" w:w="4320"/>
+          </w:tcPr>
+          <w:p/>
+        </w:tc>
+      </w:tr>
+      <w:tr>
+        <w:tc>
+          <w:tcPr>
+            <w:tcW w:type="dxa" w:w="4320"/>
+          </w:tcPr>
+          <w:p/>
+        </w:tc>
+        <w:tc>
+          <w:tcPr>
+            <w:tcW w:type="dxa" w:w="4320"/>
+          </w:tcPr>
+          <w:p/>
+        </w:tc>
+      </w:tr>
+      <w:tr>
+        <w:tc>
+          <w:tcPr>
+            <w:tcW w:type="dxa" w:w="4320"/>
+          </w:tcPr>
+          <w:p/>
+        </w:tc>
+        <w:tc>
+          <w:tcPr>
+            <w:tcW w:type="dxa" w:w="4320"/>
+          </w:tcPr>
+          <w:p/>
+        </w:tc>
+      </w:tr>
+      <w:tr>
+        <w:tc>
+          <w:tcPr>
+            <w:tcW w:type="dxa" w:w="4320"/>
+          </w:tcPr>
+          <w:p/>
+        </w:tc>
+        <w:tc>
+          <w:tcPr>
+            <w:tcW w:type="dxa" w:w="4320"/>
+          </w:tcPr>
+          <w:p/>
+        </w:tc>
+      </w:tr>
+      <w:tr>
+        <w:tc>
+          <w:tcPr>
+            <w:tcW w:type="dxa" w:w="4320"/>
+          </w:tcPr>
+          <w:p/>
+        </w:tc>
+        <w:tc>
+          <w:tcPr>
+            <w:tcW w:type="dxa" w:w="4320"/>
+          </w:tcPr>
+          <w:p/>
+        </w:tc>
+      </w:tr>
+      <w:tr>
+        <w:tc>
+          <w:tcPr>
+            <w:tcW w:type="dxa" w:w="4320"/>
+          </w:tcPr>
+          <w:p/>
+        </w:tc>
+        <w:tc>
+          <w:tcPr>
+            <w:tcW w:type="dxa" w:w="4320"/>
+          </w:tcPr>
+          <w:p/>
+        </w:tc>
+      </w:tr>
+      <w:tr>
+        <w:tc>
+          <w:tcPr>
+            <w:tcW w:type="dxa" w:w="4320"/>
+          </w:tcPr>
+          <w:p/>
+        </w:tc>
+        <w:tc>
+          <w:tcPr>
+            <w:tcW w:type="dxa" w:w="4320"/>
+          </w:tcPr>
+          <w:p/>
+        </w:tc>
+      </w:tr>
+      <w:tr>
+        <w:tc>
+          <w:tcPr>
+            <w:tcW w:type="dxa" w:w="4320"/>
+          </w:tcPr>
+          <w:p/>
+        </w:tc>
+        <w:tc>
+          <w:tcPr>
+            <w:tcW w:type="dxa" w:w="4320"/>
+          </w:tcPr>
+          <w:p/>
+        </w:tc>
+      </w:tr>
+      <w:tr>
+        <w:tc>
+          <w:tcPr>
+            <w:tcW w:type="dxa" w:w="4320"/>
+          </w:tcPr>
+          <w:p/>
+        </w:tc>
+        <w:tc>
+          <w:tcPr>
+            <w:tcW w:type="dxa" w:w="4320"/>
+          </w:tcPr>
+          <w:p/>
+        </w:tc>
+      </w:tr>
+      <w:tr>
+        <w:tc>
+          <w:tcPr>
+            <w:tcW w:type="dxa" w:w="4320"/>
+          </w:tcPr>
+          <w:p>
+            <w:r>
+              <w:t>Test framework</w:t>
+            </w:r>
+          </w:p>
+        </w:tc>
+        <w:tc>
+          <w:tcPr>
+            <w:tcW w:type="dxa" w:w="4320"/>
+          </w:tcPr>
+          <w:p>
+            <w:r>
+              <w:t>PHPUnit 11.5.44</w:t>
+            </w:r>
+          </w:p>
+        </w:tc>
+      </w:tr>
+      <w:tr>
+        <w:tc>
+          <w:tcPr>
+            <w:tcW w:type="dxa" w:w="4320"/>
+          </w:tcPr>
+          <w:p>
+            <w:r>
+              <w:t>PHP version</w:t>
+            </w:r>
+          </w:p>
+        </w:tc>
+        <w:tc>
+          <w:tcPr>
+            <w:tcW w:type="dxa" w:w="4320"/>
+          </w:tcPr>
+          <w:p>
+            <w:r>
+              <w:t>PHP 8.3.6</w:t>
+            </w:r>
+          </w:p>
+        </w:tc>
+      </w:tr>
+      <w:tr>
+        <w:tc>
+          <w:tcPr>
+            <w:tcW w:type="dxa" w:w="4320"/>
+          </w:tcPr>
+          <w:p>
+            <w:r>
+              <w:t>Test class</w:t>
+            </w:r>
+          </w:p>
+        </w:tc>
+        <w:tc>
+          <w:tcPr>
+            <w:tcW w:type="dxa" w:w="4320"/>
+          </w:tcPr>
+          <w:p>
+            <w:r>
+              <w:t>Tests\Feature\AttendanceShiftLogicTest</w:t>
+            </w:r>
+          </w:p>
+        </w:tc>
+      </w:tr>
+      <w:tr>
+        <w:tc>
+          <w:tcPr>
+            <w:tcW w:type="dxa" w:w="4320"/>
+          </w:tcPr>
+          <w:p>
+            <w:r>
+              <w:t>Total test cases</w:t>
+            </w:r>
+          </w:p>
+        </w:tc>
+        <w:tc>
+          <w:tcPr>
+            <w:tcW w:type="dxa" w:w="4320"/>
+          </w:tcPr>
+          <w:p>
+            <w:r>
+              <w:t>7</w:t>
+            </w:r>
+          </w:p>
+        </w:tc>
+      </w:tr>
+      <w:tr>
+        <w:tc>
+          <w:tcPr>
+            <w:tcW w:type="dxa" w:w="4320"/>
+          </w:tcPr>
+          <w:p>
+            <w:r>
+              <w:t>Assertions</w:t>
+            </w:r>
+          </w:p>
+        </w:tc>
+        <w:tc>
+          <w:tcPr>
+            <w:tcW w:type="dxa" w:w="4320"/>
+          </w:tcPr>
+          <w:p>
+            <w:r>
+              <w:t>10</w:t>
+            </w:r>
+          </w:p>
+        </w:tc>
+      </w:tr>
+      <w:tr>
+        <w:tc>
+          <w:tcPr>
+            <w:tcW w:type="dxa" w:w="4320"/>
+          </w:tcPr>
+          <w:p>
+            <w:r>
+              <w:t>Passed</w:t>
+            </w:r>
+          </w:p>
+        </w:tc>
+        <w:tc>
+          <w:tcPr>
+            <w:tcW w:type="dxa" w:w="4320"/>
+          </w:tcPr>
+          <w:p>
+            <w:r>
+              <w:t>7</w:t>
+            </w:r>
+          </w:p>
+        </w:tc>
+      </w:tr>
+      <w:tr>
+        <w:tc>
+          <w:tcPr>
+            <w:tcW w:type="dxa" w:w="4320"/>
+          </w:tcPr>
+          <w:p>
+            <w:r>
+              <w:t>Failed</w:t>
+            </w:r>
+          </w:p>
+        </w:tc>
+        <w:tc>
+          <w:tcPr>
+            <w:tcW w:type="dxa" w:w="4320"/>
+          </w:tcPr>
+          <w:p>
+            <w:r>
+              <w:t>0</w:t>
+            </w:r>
+          </w:p>
+        </w:tc>
+      </w:tr>
+      <w:tr>
+        <w:tc>
+          <w:tcPr>
+            <w:tcW w:type="dxa" w:w="4320"/>
+          </w:tcPr>
+          <w:p>
+            <w:r>
+              <w:t>Duration</w:t>
+            </w:r>
+          </w:p>
+        </w:tc>
+        <w:tc>
+          <w:tcPr>
+            <w:tcW w:type="dxa" w:w="4320"/>
+          </w:tcPr>
+          <w:p>
+            <w:r>
+              <w:t>0.567 s</w:t>
+            </w:r>
+          </w:p>
+        </w:tc>
+      </w:tr>
+      <w:tr>
+        <w:tc>
+          <w:tcPr>
+            <w:tcW w:type="dxa" w:w="4320"/>
+          </w:tcPr>
+          <w:p>
+            <w:r>
+              <w:t>Peak memory</w:t>
+            </w:r>
+          </w:p>
+        </w:tc>
+        <w:tc>
+          <w:tcPr>
+            <w:tcW w:type="dxa" w:w="4320"/>
+          </w:tcPr>
+          <w:p>
+            <w:r>
+              <w:t>52.50 MB</w:t>
+            </w:r>
+          </w:p>
+        </w:tc>
+      </w:tr>
+    </w:tbl>
+    <w:p/>
+    <w:p>
+      <w:pPr/>
+      <w:r>
+        <w:t>5.3.2  Individual Test Case Results</w:t>
+      </w:r>
+    </w:p>
+    <w:tbl>
+      <w:tblPr>
+        <w:tblStyle w:val="TableGrid"/>
+        <w:tblW w:type="auto" w:w="0"/>
+        <w:tblLook w:firstColumn="1" w:firstRow="1" w:lastColumn="0" w:lastRow="0" w:noHBand="0" w:noVBand="1" w:val="04A0"/>
+      </w:tblPr>
+      <w:tblGrid>
+        <w:gridCol w:w="1440"/>
+        <w:gridCol w:w="1440"/>
+        <w:gridCol w:w="1440"/>
+        <w:gridCol w:w="1440"/>
+        <w:gridCol w:w="1440"/>
+        <w:gridCol w:w="1440"/>
+      </w:tblGrid>
+      <w:tr>
+        <w:tc>
+          <w:tcPr>
+            <w:tcW w:type="dxa" w:w="1440"/>
+          </w:tcPr>
+          <w:p>
+            <w:r>
+              <w:rPr>
+                <w:b/>
+              </w:rPr>
+              <w:t>#</w:t>
+            </w:r>
+          </w:p>
+        </w:tc>
+        <w:tc>
+          <w:tcPr>
+            <w:tcW w:type="dxa" w:w="1440"/>
+          </w:tcPr>
+          <w:p>
+            <w:r>
+              <w:rPr>
+                <w:b/>
+              </w:rPr>
+              <w:t>Test Case</w:t>
+            </w:r>
+          </w:p>
+        </w:tc>
+        <w:tc>
+          <w:tcPr>
+            <w:tcW w:type="dxa" w:w="1440"/>
+          </w:tcPr>
+          <w:p>
+            <w:r>
+              <w:rPr>
+                <w:b/>
+              </w:rPr>
+              <w:t>Description</w:t>
+            </w:r>
+          </w:p>
+        </w:tc>
+        <w:tc>
+          <w:tcPr>
+            <w:tcW w:type="dxa" w:w="1440"/>
+          </w:tcPr>
+          <w:p>
+            <w:r>
+              <w:rPr>
+                <w:b/>
+              </w:rPr>
+              <w:t>Expected Result</w:t>
+            </w:r>
+          </w:p>
+        </w:tc>
+        <w:tc>
+          <w:tcPr>
+            <w:tcW w:type="dxa" w:w="1440"/>
+          </w:tcPr>
+          <w:p>
+            <w:r>
+              <w:rPr>
+                <w:b/>
+              </w:rPr>
+              <w:t>Actual Result</w:t>
+            </w:r>
+          </w:p>
+        </w:tc>
+        <w:tc>
+          <w:tcPr>
+            <w:tcW w:type="dxa" w:w="1440"/>
+          </w:tcPr>
+          <w:p>
+            <w:r>
+              <w:rPr>
+                <w:b/>
+              </w:rPr>
+              <w:t>Status</w:t>
+            </w:r>
+          </w:p>
+        </w:tc>
+      </w:tr>
+      <w:tr>
+        <w:tc>
+          <w:tcPr>
+            <w:tcW w:type="dxa" w:w="1440"/>
+          </w:tcPr>
+          <w:p/>
+        </w:tc>
+        <w:tc>
+          <w:tcPr>
+            <w:tcW w:type="dxa" w:w="1440"/>
+          </w:tcPr>
+          <w:p/>
+        </w:tc>
+        <w:tc>
+          <w:tcPr>
+            <w:tcW w:type="dxa" w:w="1440"/>
+          </w:tcPr>
+          <w:p/>
+        </w:tc>
+        <w:tc>
+          <w:tcPr>
+            <w:tcW w:type="dxa" w:w="1440"/>
+          </w:tcPr>
+          <w:p/>
+        </w:tc>
+        <w:tc>
+          <w:tcPr>
+            <w:tcW w:type="dxa" w:w="1440"/>
+          </w:tcPr>
+          <w:p/>
+        </w:tc>
+        <w:tc>
+          <w:tcPr>
+            <w:tcW w:type="dxa" w:w="1440"/>
+          </w:tcPr>
+          <w:p/>
+        </w:tc>
+      </w:tr>
+      <w:tr>
+        <w:tc>
+          <w:tcPr>
+            <w:tcW w:type="dxa" w:w="1440"/>
+          </w:tcPr>
+          <w:p/>
+        </w:tc>
+        <w:tc>
+          <w:tcPr>
+            <w:tcW w:type="dxa" w:w="1440"/>
+          </w:tcPr>
+          <w:p/>
+        </w:tc>
+        <w:tc>
+          <w:tcPr>
+            <w:tcW w:type="dxa" w:w="1440"/>
+          </w:tcPr>
+          <w:p/>
+        </w:tc>
+        <w:tc>
+          <w:tcPr>
+            <w:tcW w:type="dxa" w:w="1440"/>
+          </w:tcPr>
+          <w:p/>
+        </w:tc>
+        <w:tc>
+          <w:tcPr>
+            <w:tcW w:type="dxa" w:w="1440"/>
+          </w:tcPr>
+          <w:p/>
+        </w:tc>
+        <w:tc>
+          <w:tcPr>
+            <w:tcW w:type="dxa" w:w="1440"/>
+          </w:tcPr>
+          <w:p/>
+        </w:tc>
+      </w:tr>
+      <w:tr>
+        <w:tc>
+          <w:tcPr>
+            <w:tcW w:type="dxa" w:w="1440"/>
+          </w:tcPr>
+          <w:p/>
+        </w:tc>
+        <w:tc>
+          <w:tcPr>
+            <w:tcW w:type="dxa" w:w="1440"/>
+          </w:tcPr>
+          <w:p/>
+        </w:tc>
+        <w:tc>
+          <w:tcPr>
+            <w:tcW w:type="dxa" w:w="1440"/>
+          </w:tcPr>
+          <w:p/>
+        </w:tc>
+        <w:tc>
+          <w:tcPr>
+            <w:tcW w:type="dxa" w:w="1440"/>
+          </w:tcPr>
+          <w:p/>
+        </w:tc>
+        <w:tc>
+          <w:tcPr>
+            <w:tcW w:type="dxa" w:w="1440"/>
+          </w:tcPr>
+          <w:p/>
+        </w:tc>
+        <w:tc>
+          <w:tcPr>
+            <w:tcW w:type="dxa" w:w="1440"/>
+          </w:tcPr>
+          <w:p/>
+        </w:tc>
+      </w:tr>
+      <w:tr>
+        <w:tc>
+          <w:tcPr>
+            <w:tcW w:type="dxa" w:w="1440"/>
+          </w:tcPr>
+          <w:p/>
+        </w:tc>
+        <w:tc>
+          <w:tcPr>
+            <w:tcW w:type="dxa" w:w="1440"/>
+          </w:tcPr>
+          <w:p/>
+        </w:tc>
+        <w:tc>
+          <w:tcPr>
+            <w:tcW w:type="dxa" w:w="1440"/>
+          </w:tcPr>
+          <w:p/>
+        </w:tc>
+        <w:tc>
+          <w:tcPr>
+            <w:tcW w:type="dxa" w:w="1440"/>
+          </w:tcPr>
+          <w:p/>
+        </w:tc>
+        <w:tc>
+          <w:tcPr>
+            <w:tcW w:type="dxa" w:w="1440"/>
+          </w:tcPr>
+          <w:p/>
+        </w:tc>
+        <w:tc>
+          <w:tcPr>
+            <w:tcW w:type="dxa" w:w="1440"/>
+          </w:tcPr>
+          <w:p/>
+        </w:tc>
+      </w:tr>
+      <w:tr>
+        <w:tc>
+          <w:tcPr>
+            <w:tcW w:type="dxa" w:w="1440"/>
+          </w:tcPr>
+          <w:p/>
+        </w:tc>
+        <w:tc>
+          <w:tcPr>
+            <w:tcW w:type="dxa" w:w="1440"/>
+          </w:tcPr>
+          <w:p/>
+        </w:tc>
+        <w:tc>
+          <w:tcPr>
+            <w:tcW w:type="dxa" w:w="1440"/>
+          </w:tcPr>
+          <w:p/>
+        </w:tc>
+        <w:tc>
+          <w:tcPr>
+            <w:tcW w:type="dxa" w:w="1440"/>
+          </w:tcPr>
+          <w:p/>
+        </w:tc>
+        <w:tc>
+          <w:tcPr>
+            <w:tcW w:type="dxa" w:w="1440"/>
+          </w:tcPr>
+          <w:p/>
+        </w:tc>
+        <w:tc>
+          <w:tcPr>
+            <w:tcW w:type="dxa" w:w="1440"/>
+          </w:tcPr>
+          <w:p/>
+        </w:tc>
+      </w:tr>
+      <w:tr>
+        <w:tc>
+          <w:tcPr>
+            <w:tcW w:type="dxa" w:w="1440"/>
+          </w:tcPr>
+          <w:p/>
+        </w:tc>
+        <w:tc>
+          <w:tcPr>
+            <w:tcW w:type="dxa" w:w="1440"/>
+          </w:tcPr>
+          <w:p/>
+        </w:tc>
+        <w:tc>
+          <w:tcPr>
+            <w:tcW w:type="dxa" w:w="1440"/>
+          </w:tcPr>
+          <w:p/>
+        </w:tc>
+        <w:tc>
+          <w:tcPr>
+            <w:tcW w:type="dxa" w:w="1440"/>
+          </w:tcPr>
+          <w:p/>
+        </w:tc>
+        <w:tc>
+          <w:tcPr>
+            <w:tcW w:type="dxa" w:w="1440"/>
+          </w:tcPr>
+          <w:p/>
+        </w:tc>
+        <w:tc>
+          <w:tcPr>
+            <w:tcW w:type="dxa" w:w="1440"/>
+          </w:tcPr>
+          <w:p/>
+        </w:tc>
+      </w:tr>
+      <w:tr>
+        <w:tc>
+          <w:tcPr>
+            <w:tcW w:type="dxa" w:w="1440"/>
+          </w:tcPr>
+          <w:p/>
+        </w:tc>
+        <w:tc>
+          <w:tcPr>
+            <w:tcW w:type="dxa" w:w="1440"/>
+          </w:tcPr>
+          <w:p/>
+        </w:tc>
+        <w:tc>
+          <w:tcPr>
+            <w:tcW w:type="dxa" w:w="1440"/>
+          </w:tcPr>
+          <w:p/>
+        </w:tc>
+        <w:tc>
+          <w:tcPr>
+            <w:tcW w:type="dxa" w:w="1440"/>
+          </w:tcPr>
+          <w:p/>
+        </w:tc>
+        <w:tc>
+          <w:tcPr>
+            <w:tcW w:type="dxa" w:w="1440"/>
+          </w:tcPr>
+          <w:p/>
+        </w:tc>
+        <w:tc>
+          <w:tcPr>
+            <w:tcW w:type="dxa" w:w="1440"/>
+          </w:tcPr>
+          <w:p/>
+        </w:tc>
+      </w:tr>
+      <w:tr>
+        <w:tc>
+          <w:tcPr>
+            <w:tcW w:type="dxa" w:w="1440"/>
+          </w:tcPr>
+          <w:p>
+            <w:r>
+              <w:t>TC-A01</w:t>
+            </w:r>
+          </w:p>
+        </w:tc>
+        <w:tc>
+          <w:tcPr>
+            <w:tcW w:type="dxa" w:w="1440"/>
+          </w:tcPr>
+          <w:p>
+            <w:r>
+              <w:t>it uses day shift window by default</w:t>
+            </w:r>
+          </w:p>
+        </w:tc>
+        <w:tc>
+          <w:tcPr>
+            <w:tcW w:type="dxa" w:w="1440"/>
+          </w:tcPr>
+          <w:p>
+            <w:r>
+              <w:t>Reference: 2026-04-15 10:00, day_shift_starts_at=8. Operational day should span from 08:00 to next-day 08:00.</w:t>
+            </w:r>
+          </w:p>
+        </w:tc>
+        <w:tc>
+          <w:tcPr>
+            <w:tcW w:type="dxa" w:w="1440"/>
+          </w:tcPr>
+          <w:p>
+            <w:r>
+              <w:t>Start: 2026-04-15 08:00</w:t>
+              <w:br/>
+              <w:t>End: 2026-04-16 08:00</w:t>
+            </w:r>
+          </w:p>
+        </w:tc>
+        <w:tc>
+          <w:tcPr>
+            <w:tcW w:type="dxa" w:w="1440"/>
+          </w:tcPr>
+          <w:p>
+            <w:r>
+              <w:t>Start: 2026-04-15 08:00</w:t>
+              <w:br/>
+              <w:t>End: 2026-04-16 08:00</w:t>
+            </w:r>
+          </w:p>
+        </w:tc>
+        <w:tc>
+          <w:tcPr>
+            <w:tcW w:type="dxa" w:w="1440"/>
+          </w:tcPr>
+          <w:p>
+            <w:r>
+              <w:t>PASS</w:t>
+            </w:r>
+          </w:p>
+        </w:tc>
+      </w:tr>
+      <w:tr>
+        <w:tc>
+          <w:tcPr>
+            <w:tcW w:type="dxa" w:w="1440"/>
+          </w:tcPr>
+          <w:p>
+            <w:r>
+              <w:t>TC-A02</w:t>
+            </w:r>
+          </w:p>
+        </w:tc>
+        <w:tc>
+          <w:tcPr>
+            <w:tcW w:type="dxa" w:w="1440"/>
+          </w:tcPr>
+          <w:p>
+            <w:r>
+              <w:t>it uses night shift window when selected</w:t>
+            </w:r>
+          </w:p>
+        </w:tc>
+        <w:tc>
+          <w:tcPr>
+            <w:tcW w:type="dxa" w:w="1440"/>
+          </w:tcPr>
+          <w:p>
+            <w:r>
+              <w:t>Reference: 2026-04-15 22:00, night_shift_starts_at=17. Operational day should start at 17:00.</w:t>
+            </w:r>
+          </w:p>
+        </w:tc>
+        <w:tc>
+          <w:tcPr>
+            <w:tcW w:type="dxa" w:w="1440"/>
+          </w:tcPr>
+          <w:p>
+            <w:r>
+              <w:t>Start: 2026-04-15 17:00</w:t>
+              <w:br/>
+              <w:t>End: 2026-04-16 17:00</w:t>
+            </w:r>
+          </w:p>
+        </w:tc>
+        <w:tc>
+          <w:tcPr>
+            <w:tcW w:type="dxa" w:w="1440"/>
+          </w:tcPr>
+          <w:p>
+            <w:r>
+              <w:t>Start: 2026-04-15 17:00</w:t>
+              <w:br/>
+              <w:t>End: 2026-04-16 17:00</w:t>
+            </w:r>
+          </w:p>
+        </w:tc>
+        <w:tc>
+          <w:tcPr>
+            <w:tcW w:type="dxa" w:w="1440"/>
+          </w:tcPr>
+          <w:p>
+            <w:r>
+              <w:t>PASS</w:t>
+            </w:r>
+          </w:p>
+        </w:tc>
+      </w:tr>
+      <w:tr>
+        <w:tc>
+          <w:tcPr>
+            <w:tcW w:type="dxa" w:w="1440"/>
+          </w:tcPr>
+          <w:p>
+            <w:r>
+              <w:t>TC-A03</w:t>
+            </w:r>
+          </w:p>
+        </w:tc>
+        <w:tc>
+          <w:tcPr>
+            <w:tcW w:type="dxa" w:w="1440"/>
+          </w:tcPr>
+          <w:p>
+            <w:r>
+              <w:t>it detects stale open shifts after max hours</w:t>
+            </w:r>
+          </w:p>
+        </w:tc>
+        <w:tc>
+          <w:tcPr>
+            <w:tcW w:type="dxa" w:w="1440"/>
+          </w:tcPr>
+          <w:p>
+            <w:r>
+              <w:t>Clock-in at 06:00, reference at 23:00 same day (17 h). max_shift_hours=16. Shift should be flagged stale.</w:t>
+            </w:r>
+          </w:p>
+        </w:tc>
+        <w:tc>
+          <w:tcPr>
+            <w:tcW w:type="dxa" w:w="1440"/>
+          </w:tcPr>
+          <w:p>
+            <w:r>
+              <w:t>isStaleShift() = true</w:t>
+            </w:r>
+          </w:p>
+        </w:tc>
+        <w:tc>
+          <w:tcPr>
+            <w:tcW w:type="dxa" w:w="1440"/>
+          </w:tcPr>
+          <w:p>
+            <w:r>
+              <w:t>isStaleShift() = true</w:t>
+            </w:r>
+          </w:p>
+        </w:tc>
+        <w:tc>
+          <w:tcPr>
+            <w:tcW w:type="dxa" w:w="1440"/>
+          </w:tcPr>
+          <w:p>
+            <w:r>
+              <w:t>PASS</w:t>
+            </w:r>
+          </w:p>
+        </w:tc>
+      </w:tr>
+      <w:tr>
+        <w:tc>
+          <w:tcPr>
+            <w:tcW w:type="dxa" w:w="1440"/>
+          </w:tcPr>
+          <w:p>
+            <w:r>
+              <w:t>TC-A04</w:t>
+            </w:r>
+          </w:p>
+        </w:tc>
+        <w:tc>
+          <w:tcPr>
+            <w:tcW w:type="dxa" w:w="1440"/>
+          </w:tcPr>
+          <w:p>
+            <w:r>
+              <w:t>manager widget is hidden from staff</w:t>
+            </w:r>
+          </w:p>
+        </w:tc>
+        <w:tc>
+          <w:tcPr>
+            <w:tcW w:type="dxa" w:w="1440"/>
+          </w:tcPr>
+          <w:p>
+            <w:r>
+              <w:t>StaffAttendanceOverviewStatsWidget.canView() must return false for Role 3 (Staff) and true for Role 2 (Manager).</w:t>
+            </w:r>
+          </w:p>
+        </w:tc>
+        <w:tc>
+          <w:tcPr>
+            <w:tcW w:type="dxa" w:w="1440"/>
+          </w:tcPr>
+          <w:p>
+            <w:r>
+              <w:t>Staff: false, Manager: true</w:t>
+            </w:r>
+          </w:p>
+        </w:tc>
+        <w:tc>
+          <w:tcPr>
+            <w:tcW w:type="dxa" w:w="1440"/>
+          </w:tcPr>
+          <w:p>
+            <w:r>
+              <w:t>Staff: false, Manager: true</w:t>
+            </w:r>
+          </w:p>
+        </w:tc>
+        <w:tc>
+          <w:tcPr>
+            <w:tcW w:type="dxa" w:w="1440"/>
+          </w:tcPr>
+          <w:p>
+            <w:r>
+              <w:t>PASS</w:t>
+            </w:r>
+          </w:p>
+        </w:tc>
+      </w:tr>
+      <w:tr>
+        <w:tc>
+          <w:tcPr>
+            <w:tcW w:type="dxa" w:w="1440"/>
+          </w:tcPr>
+          <w:p>
+            <w:r>
+              <w:t>TC-A05</w:t>
+            </w:r>
+          </w:p>
+        </w:tc>
+        <w:tc>
+          <w:tcPr>
+            <w:tcW w:type="dxa" w:w="1440"/>
+          </w:tcPr>
+          <w:p>
+            <w:r>
+              <w:t>overtime starts after standard workday hours</w:t>
+            </w:r>
+          </w:p>
+        </w:tc>
+        <w:tc>
+          <w:tcPr>
+            <w:tcW w:type="dxa" w:w="1440"/>
+          </w:tcPr>
+          <w:p>
+            <w:r>
+              <w:t>Clock-in 08:00, clock-out 18:30 (10.5 h). standard_workday_hours=8. Overtime = 150 min.</w:t>
+            </w:r>
+          </w:p>
+        </w:tc>
+        <w:tc>
+          <w:tcPr>
+            <w:tcW w:type="dxa" w:w="1440"/>
+          </w:tcPr>
+          <w:p>
+            <w:r>
+              <w:t>overtimeMinutes() = 150</w:t>
+            </w:r>
+          </w:p>
+        </w:tc>
+        <w:tc>
+          <w:tcPr>
+            <w:tcW w:type="dxa" w:w="1440"/>
+          </w:tcPr>
+          <w:p>
+            <w:r>
+              <w:t>overtimeMinutes() = 150</w:t>
+            </w:r>
+          </w:p>
+        </w:tc>
+        <w:tc>
+          <w:tcPr>
+            <w:tcW w:type="dxa" w:w="1440"/>
+          </w:tcPr>
+          <w:p>
+            <w:r>
+              <w:t>PASS</w:t>
+            </w:r>
+          </w:p>
+        </w:tc>
+      </w:tr>
+      <w:tr>
+        <w:tc>
+          <w:tcPr>
+            <w:tcW w:type="dxa" w:w="1440"/>
+          </w:tcPr>
+          <w:p>
+            <w:r>
+              <w:t>TC-A06</w:t>
+            </w:r>
+          </w:p>
+        </w:tc>
+        <w:tc>
+          <w:tcPr>
+            <w:tcW w:type="dxa" w:w="1440"/>
+          </w:tcPr>
+          <w:p>
+            <w:r>
+              <w:t>night shift overtime starts after standard hours</w:t>
+            </w:r>
+          </w:p>
+        </w:tc>
+        <w:tc>
+          <w:tcPr>
+            <w:tcW w:type="dxa" w:w="1440"/>
+          </w:tcPr>
+          <w:p>
+            <w:r>
+              <w:t>Clock-in 17:00, clock-out 03:30 next day (10.5 h). night_shift_standard_hours=8. Overtime = 150 min.</w:t>
+            </w:r>
+          </w:p>
+        </w:tc>
+        <w:tc>
+          <w:tcPr>
+            <w:tcW w:type="dxa" w:w="1440"/>
+          </w:tcPr>
+          <w:p>
+            <w:r>
+              <w:t>overtimeMinutes() = 150</w:t>
+            </w:r>
+          </w:p>
+        </w:tc>
+        <w:tc>
+          <w:tcPr>
+            <w:tcW w:type="dxa" w:w="1440"/>
+          </w:tcPr>
+          <w:p>
+            <w:r>
+              <w:t>overtimeMinutes() = 150</w:t>
+            </w:r>
+          </w:p>
+        </w:tc>
+        <w:tc>
+          <w:tcPr>
+            <w:tcW w:type="dxa" w:w="1440"/>
+          </w:tcPr>
+          <w:p>
+            <w:r>
+              <w:t>PASS</w:t>
+            </w:r>
+          </w:p>
+        </w:tc>
+      </w:tr>
+      <w:tr>
+        <w:tc>
+          <w:tcPr>
+            <w:tcW w:type="dxa" w:w="1440"/>
+          </w:tcPr>
+          <w:p>
+            <w:r>
+              <w:t>TC-A07</w:t>
+            </w:r>
+          </w:p>
+        </w:tc>
+        <w:tc>
+          <w:tcPr>
+            <w:tcW w:type="dxa" w:w="1440"/>
+          </w:tcPr>
+          <w:p>
+            <w:r>
+              <w:t>overtime is zero when work is shorter than standard hours</w:t>
+            </w:r>
+          </w:p>
+        </w:tc>
+        <w:tc>
+          <w:tcPr>
+            <w:tcW w:type="dxa" w:w="1440"/>
+          </w:tcPr>
+          <w:p>
+            <w:r>
+              <w:t>Clock-in 08:00, clock-out 15:45 (7.75 h). standard_workday_hours=8. No overtime.</w:t>
+            </w:r>
+          </w:p>
+        </w:tc>
+        <w:tc>
+          <w:tcPr>
+            <w:tcW w:type="dxa" w:w="1440"/>
+          </w:tcPr>
+          <w:p>
+            <w:r>
+              <w:t>overtimeMinutes() = 0</w:t>
+            </w:r>
+          </w:p>
+        </w:tc>
+        <w:tc>
+          <w:tcPr>
+            <w:tcW w:type="dxa" w:w="1440"/>
+          </w:tcPr>
+          <w:p>
+            <w:r>
+              <w:t>overtimeMinutes() = 0</w:t>
+            </w:r>
+          </w:p>
+        </w:tc>
+        <w:tc>
+          <w:tcPr>
+            <w:tcW w:type="dxa" w:w="1440"/>
+          </w:tcPr>
+          <w:p>
+            <w:r>
+              <w:t>PASS</w:t>
+            </w:r>
+          </w:p>
+        </w:tc>
+      </w:tr>
+    </w:tbl>
+    <w:p/>
+    <w:p>
+      <w:pPr>
+        <w:pStyle w:val="Heading2"/>
+      </w:pPr>
+      <w:r>
+        <w:t>5.4  User Acceptance Testing (UAT)</w:t>
+      </w:r>
+    </w:p>
+    <w:p>
+      <w:pPr/>
+      <w:r>
+        <w:t>User Acceptance Testing was conducted by executing predefined test scripts for each user role through a browser connected to the local development environment. Each test case specifies preconditions, test steps, expected result, and observed outcome.</w:t>
+      </w:r>
+    </w:p>
+    <w:p>
+      <w:pPr>
+        <w:pStyle w:val="Heading3"/>
+      </w:pPr>
+      <w:r>
+        <w:t>5.4.1  UAT – Staff Role</w:t>
+      </w:r>
+    </w:p>
+    <w:tbl>
+      <w:tblPr>
+        <w:tblStyle w:val="TableGrid"/>
+        <w:tblW w:type="auto" w:w="0"/>
+        <w:tblLook w:firstColumn="1" w:firstRow="1" w:lastColumn="0" w:lastRow="0" w:noHBand="0" w:noVBand="1" w:val="04A0"/>
+      </w:tblPr>
+      <w:tblGrid>
+        <w:gridCol w:w="1440"/>
+        <w:gridCol w:w="1440"/>
+        <w:gridCol w:w="1440"/>
+        <w:gridCol w:w="1440"/>
+        <w:gridCol w:w="1440"/>
+        <w:gridCol w:w="1440"/>
+      </w:tblGrid>
+      <w:tr>
+        <w:tc>
+          <w:tcPr>
+            <w:tcW w:type="dxa" w:w="1440"/>
+          </w:tcPr>
+          <w:p>
+            <w:r>
+              <w:rPr>
+                <w:b/>
+              </w:rPr>
+              <w:t>TC</w:t>
+            </w:r>
+          </w:p>
+        </w:tc>
+        <w:tc>
+          <w:tcPr>
+            <w:tcW w:type="dxa" w:w="1440"/>
+          </w:tcPr>
+          <w:p>
+            <w:r>
+              <w:rPr>
+                <w:b/>
+              </w:rPr>
+              <w:t>Test Case</w:t>
+            </w:r>
+          </w:p>
+        </w:tc>
+        <w:tc>
+          <w:tcPr>
+            <w:tcW w:type="dxa" w:w="1440"/>
+          </w:tcPr>
+          <w:p>
+            <w:r>
+              <w:rPr>
+                <w:b/>
+              </w:rPr>
+              <w:t>Steps</w:t>
+            </w:r>
+          </w:p>
+        </w:tc>
+        <w:tc>
+          <w:tcPr>
+            <w:tcW w:type="dxa" w:w="1440"/>
+          </w:tcPr>
+          <w:p>
+            <w:r>
+              <w:rPr>
+                <w:b/>
+              </w:rPr>
+              <w:t>Expected Result</w:t>
+            </w:r>
+          </w:p>
+        </w:tc>
+        <w:tc>
+          <w:tcPr>
+            <w:tcW w:type="dxa" w:w="1440"/>
+          </w:tcPr>
+          <w:p>
+            <w:r>
+              <w:rPr>
+                <w:b/>
+              </w:rPr>
+              <w:t>Actual Result</w:t>
+            </w:r>
+          </w:p>
+        </w:tc>
+        <w:tc>
+          <w:tcPr>
+            <w:tcW w:type="dxa" w:w="1440"/>
+          </w:tcPr>
+          <w:p>
+            <w:r>
+              <w:rPr>
+                <w:b/>
+              </w:rPr>
+              <w:t>Status</w:t>
+            </w:r>
+          </w:p>
+        </w:tc>
+      </w:tr>
+      <w:tr>
+        <w:tc>
+          <w:tcPr>
+            <w:tcW w:type="dxa" w:w="1440"/>
+          </w:tcPr>
+          <w:p/>
+        </w:tc>
+        <w:tc>
+          <w:tcPr>
+            <w:tcW w:type="dxa" w:w="1440"/>
+          </w:tcPr>
+          <w:p/>
+        </w:tc>
+        <w:tc>
+          <w:tcPr>
+            <w:tcW w:type="dxa" w:w="1440"/>
+          </w:tcPr>
+          <w:p/>
+        </w:tc>
+        <w:tc>
+          <w:tcPr>
+            <w:tcW w:type="dxa" w:w="1440"/>
+          </w:tcPr>
+          <w:p/>
+        </w:tc>
+        <w:tc>
+          <w:tcPr>
+            <w:tcW w:type="dxa" w:w="1440"/>
+          </w:tcPr>
+          <w:p/>
+        </w:tc>
+        <w:tc>
+          <w:tcPr>
+            <w:tcW w:type="dxa" w:w="1440"/>
+          </w:tcPr>
+          <w:p/>
+        </w:tc>
+      </w:tr>
+      <w:tr>
+        <w:tc>
+          <w:tcPr>
+            <w:tcW w:type="dxa" w:w="1440"/>
+          </w:tcPr>
+          <w:p/>
+        </w:tc>
+        <w:tc>
+          <w:tcPr>
+            <w:tcW w:type="dxa" w:w="1440"/>
+          </w:tcPr>
+          <w:p/>
+        </w:tc>
+        <w:tc>
+          <w:tcPr>
+            <w:tcW w:type="dxa" w:w="1440"/>
+          </w:tcPr>
+          <w:p/>
+        </w:tc>
+        <w:tc>
+          <w:tcPr>
+            <w:tcW w:type="dxa" w:w="1440"/>
+          </w:tcPr>
+          <w:p/>
+        </w:tc>
+        <w:tc>
+          <w:tcPr>
+            <w:tcW w:type="dxa" w:w="1440"/>
+          </w:tcPr>
+          <w:p/>
+        </w:tc>
+        <w:tc>
+          <w:tcPr>
+            <w:tcW w:type="dxa" w:w="1440"/>
+          </w:tcPr>
+          <w:p/>
+        </w:tc>
+      </w:tr>
+      <w:tr>
+        <w:tc>
+          <w:tcPr>
+            <w:tcW w:type="dxa" w:w="1440"/>
+          </w:tcPr>
+          <w:p/>
+        </w:tc>
+        <w:tc>
+          <w:tcPr>
+            <w:tcW w:type="dxa" w:w="1440"/>
+          </w:tcPr>
+          <w:p/>
+        </w:tc>
+        <w:tc>
+          <w:tcPr>
+            <w:tcW w:type="dxa" w:w="1440"/>
+          </w:tcPr>
+          <w:p/>
+        </w:tc>
+        <w:tc>
+          <w:tcPr>
+            <w:tcW w:type="dxa" w:w="1440"/>
+          </w:tcPr>
+          <w:p/>
+        </w:tc>
+        <w:tc>
+          <w:tcPr>
+            <w:tcW w:type="dxa" w:w="1440"/>
+          </w:tcPr>
+          <w:p/>
+        </w:tc>
+        <w:tc>
+          <w:tcPr>
+            <w:tcW w:type="dxa" w:w="1440"/>
+          </w:tcPr>
+          <w:p/>
+        </w:tc>
+      </w:tr>
+      <w:tr>
+        <w:tc>
+          <w:tcPr>
+            <w:tcW w:type="dxa" w:w="1440"/>
+          </w:tcPr>
+          <w:p/>
+        </w:tc>
+        <w:tc>
+          <w:tcPr>
+            <w:tcW w:type="dxa" w:w="1440"/>
+          </w:tcPr>
+          <w:p/>
+        </w:tc>
+        <w:tc>
+          <w:tcPr>
+            <w:tcW w:type="dxa" w:w="1440"/>
+          </w:tcPr>
+          <w:p/>
+        </w:tc>
+        <w:tc>
+          <w:tcPr>
+            <w:tcW w:type="dxa" w:w="1440"/>
+          </w:tcPr>
+          <w:p/>
+        </w:tc>
+        <w:tc>
+          <w:tcPr>
+            <w:tcW w:type="dxa" w:w="1440"/>
+          </w:tcPr>
+          <w:p/>
+        </w:tc>
+        <w:tc>
+          <w:tcPr>
+            <w:tcW w:type="dxa" w:w="1440"/>
+          </w:tcPr>
+          <w:p/>
+        </w:tc>
+      </w:tr>
+      <w:tr>
+        <w:tc>
+          <w:tcPr>
+            <w:tcW w:type="dxa" w:w="1440"/>
+          </w:tcPr>
+          <w:p/>
+        </w:tc>
+        <w:tc>
+          <w:tcPr>
+            <w:tcW w:type="dxa" w:w="1440"/>
+          </w:tcPr>
+          <w:p/>
+        </w:tc>
+        <w:tc>
+          <w:tcPr>
+            <w:tcW w:type="dxa" w:w="1440"/>
+          </w:tcPr>
+          <w:p/>
+        </w:tc>
+        <w:tc>
+          <w:tcPr>
+            <w:tcW w:type="dxa" w:w="1440"/>
+          </w:tcPr>
+          <w:p/>
+        </w:tc>
+        <w:tc>
+          <w:tcPr>
+            <w:tcW w:type="dxa" w:w="1440"/>
+          </w:tcPr>
+          <w:p/>
+        </w:tc>
+        <w:tc>
+          <w:tcPr>
+            <w:tcW w:type="dxa" w:w="1440"/>
+          </w:tcPr>
+          <w:p/>
+        </w:tc>
+      </w:tr>
+      <w:tr>
+        <w:tc>
+          <w:tcPr>
+            <w:tcW w:type="dxa" w:w="1440"/>
+          </w:tcPr>
+          <w:p/>
+        </w:tc>
+        <w:tc>
+          <w:tcPr>
+            <w:tcW w:type="dxa" w:w="1440"/>
+          </w:tcPr>
+          <w:p/>
+        </w:tc>
+        <w:tc>
+          <w:tcPr>
+            <w:tcW w:type="dxa" w:w="1440"/>
+          </w:tcPr>
+          <w:p/>
+        </w:tc>
+        <w:tc>
+          <w:tcPr>
+            <w:tcW w:type="dxa" w:w="1440"/>
+          </w:tcPr>
+          <w:p/>
+        </w:tc>
+        <w:tc>
+          <w:tcPr>
+            <w:tcW w:type="dxa" w:w="1440"/>
+          </w:tcPr>
+          <w:p/>
+        </w:tc>
+        <w:tc>
+          <w:tcPr>
+            <w:tcW w:type="dxa" w:w="1440"/>
+          </w:tcPr>
+          <w:p/>
+        </w:tc>
+      </w:tr>
+      <w:tr>
+        <w:tc>
+          <w:tcPr>
+            <w:tcW w:type="dxa" w:w="1440"/>
+          </w:tcPr>
+          <w:p>
+            <w:r>
+              <w:t>TC-S01</w:t>
+            </w:r>
+          </w:p>
+        </w:tc>
+        <w:tc>
+          <w:tcPr>
+            <w:tcW w:type="dxa" w:w="1440"/>
+          </w:tcPr>
+          <w:p>
+            <w:r>
+              <w:t>Login with valid phone and password</w:t>
+            </w:r>
+          </w:p>
+        </w:tc>
+        <w:tc>
+          <w:tcPr>
+            <w:tcW w:type="dxa" w:w="1440"/>
+          </w:tcPr>
+          <w:p>
+            <w:r>
+              <w:t>1. Navigate to /login.</w:t>
+              <w:br/>
+              <w:t>2. Enter registered phone and password.</w:t>
+              <w:br/>
+              <w:t>3. Submit.</w:t>
+            </w:r>
+          </w:p>
+        </w:tc>
+        <w:tc>
+          <w:tcPr>
+            <w:tcW w:type="dxa" w:w="1440"/>
+          </w:tcPr>
+          <w:p>
+            <w:r>
+              <w:t>Redirect to Staff Panel dashboard.</w:t>
+            </w:r>
+          </w:p>
+        </w:tc>
+        <w:tc>
+          <w:tcPr>
+            <w:tcW w:type="dxa" w:w="1440"/>
+          </w:tcPr>
+          <w:p>
+            <w:r>
+              <w:t>Redirected to /staff dashboard.</w:t>
+            </w:r>
+          </w:p>
+        </w:tc>
+        <w:tc>
+          <w:tcPr>
+            <w:tcW w:type="dxa" w:w="1440"/>
+          </w:tcPr>
+          <w:p>
+            <w:r>
+              <w:t>PASS</w:t>
+            </w:r>
+          </w:p>
+        </w:tc>
+      </w:tr>
+      <w:tr>
+        <w:tc>
+          <w:tcPr>
+            <w:tcW w:type="dxa" w:w="1440"/>
+          </w:tcPr>
+          <w:p>
+            <w:r>
+              <w:t>TC-S02</w:t>
+            </w:r>
+          </w:p>
+        </w:tc>
+        <w:tc>
+          <w:tcPr>
+            <w:tcW w:type="dxa" w:w="1440"/>
+          </w:tcPr>
+          <w:p>
+            <w:r>
+              <w:t>Clock In with valid GPS location</w:t>
+            </w:r>
+          </w:p>
+        </w:tc>
+        <w:tc>
+          <w:tcPr>
+            <w:tcW w:type="dxa" w:w="1440"/>
+          </w:tcPr>
+          <w:p>
+            <w:r>
+              <w:t>1. Open Staff dashboard.</w:t>
+              <w:br/>
+              <w:t>2. Allow browser geolocation.</w:t>
+              <w:br/>
+              <w:t>3. Click "Clock In".</w:t>
+            </w:r>
+          </w:p>
+        </w:tc>
+        <w:tc>
+          <w:tcPr>
+            <w:tcW w:type="dxa" w:w="1440"/>
+          </w:tcPr>
+          <w:p>
+            <w:r>
+              <w:t>Attendance record created with status "verified" or "pending".</w:t>
+            </w:r>
+          </w:p>
+        </w:tc>
+        <w:tc>
+          <w:tcPr>
+            <w:tcW w:type="dxa" w:w="1440"/>
+          </w:tcPr>
+          <w:p>
+            <w:r>
+              <w:t>Record created; status "verified" when within site radius.</w:t>
+            </w:r>
+          </w:p>
+        </w:tc>
+        <w:tc>
+          <w:tcPr>
+            <w:tcW w:type="dxa" w:w="1440"/>
+          </w:tcPr>
+          <w:p>
+            <w:r>
+              <w:t>PASS</w:t>
+            </w:r>
+          </w:p>
+        </w:tc>
+      </w:tr>
+      <w:tr>
+        <w:tc>
+          <w:tcPr>
+            <w:tcW w:type="dxa" w:w="1440"/>
+          </w:tcPr>
+          <w:p>
+            <w:r>
+              <w:t>TC-S03</w:t>
+            </w:r>
+          </w:p>
+        </w:tc>
+        <w:tc>
+          <w:tcPr>
+            <w:tcW w:type="dxa" w:w="1440"/>
+          </w:tcPr>
+          <w:p>
+            <w:r>
+              <w:t>Clock Out</w:t>
+            </w:r>
+          </w:p>
+        </w:tc>
+        <w:tc>
+          <w:tcPr>
+            <w:tcW w:type="dxa" w:w="1440"/>
+          </w:tcPr>
+          <w:p>
+            <w:r>
+              <w:t>1. After clocking in, click "Clock Out".</w:t>
+            </w:r>
+          </w:p>
+        </w:tc>
+        <w:tc>
+          <w:tcPr>
+            <w:tcW w:type="dxa" w:w="1440"/>
+          </w:tcPr>
+          <w:p>
+            <w:r>
+              <w:t>Attendance updated with clock_out_time. Widget resets.</w:t>
+            </w:r>
+          </w:p>
+        </w:tc>
+        <w:tc>
+          <w:tcPr>
+            <w:tcW w:type="dxa" w:w="1440"/>
+          </w:tcPr>
+          <w:p>
+            <w:r>
+              <w:t>clock_out_time populated; widget refreshed correctly.</w:t>
+            </w:r>
+          </w:p>
+        </w:tc>
+        <w:tc>
+          <w:tcPr>
+            <w:tcW w:type="dxa" w:w="1440"/>
+          </w:tcPr>
+          <w:p>
+            <w:r>
+              <w:t>PASS</w:t>
+            </w:r>
+          </w:p>
+        </w:tc>
+      </w:tr>
+      <w:tr>
+        <w:tc>
+          <w:tcPr>
+            <w:tcW w:type="dxa" w:w="1440"/>
+          </w:tcPr>
+          <w:p>
+            <w:r>
+              <w:t>TC-S04</w:t>
+            </w:r>
+          </w:p>
+        </w:tc>
+        <w:tc>
+          <w:tcPr>
+            <w:tcW w:type="dxa" w:w="1440"/>
+          </w:tcPr>
+          <w:p>
+            <w:r>
+              <w:t>View personal attendance log</w:t>
+            </w:r>
+          </w:p>
+        </w:tc>
+        <w:tc>
+          <w:tcPr>
+            <w:tcW w:type="dxa" w:w="1440"/>
+          </w:tcPr>
+          <w:p>
+            <w:r>
+              <w:t>1. Navigate to "My Attendance" from sidebar.</w:t>
+            </w:r>
+          </w:p>
+        </w:tc>
+        <w:tc>
+          <w:tcPr>
+            <w:tcW w:type="dxa" w:w="1440"/>
+          </w:tcPr>
+          <w:p>
+            <w:r>
+              <w:t>Table shows personal attendance records with relevant columns.</w:t>
+            </w:r>
+          </w:p>
+        </w:tc>
+        <w:tc>
+          <w:tcPr>
+            <w:tcW w:type="dxa" w:w="1440"/>
+          </w:tcPr>
+          <w:p>
+            <w:r>
+              <w:t>Table rendered with correct records and filters.</w:t>
+            </w:r>
+          </w:p>
+        </w:tc>
+        <w:tc>
+          <w:tcPr>
+            <w:tcW w:type="dxa" w:w="1440"/>
+          </w:tcPr>
+          <w:p>
+            <w:r>
+              <w:t>PASS</w:t>
+            </w:r>
+          </w:p>
+        </w:tc>
+      </w:tr>
+      <w:tr>
+        <w:tc>
+          <w:tcPr>
+            <w:tcW w:type="dxa" w:w="1440"/>
+          </w:tcPr>
+          <w:p>
+            <w:r>
+              <w:t>TC-S05</w:t>
+            </w:r>
+          </w:p>
+        </w:tc>
+        <w:tc>
+          <w:tcPr>
+            <w:tcW w:type="dxa" w:w="1440"/>
+          </w:tcPr>
+          <w:p>
+            <w:r>
+              <w:t>Attendance warning widget visible on repeated missed clock-outs</w:t>
+            </w:r>
+          </w:p>
+        </w:tc>
+        <w:tc>
+          <w:tcPr>
+            <w:tcW w:type="dxa" w:w="1440"/>
+          </w:tcPr>
+          <w:p>
+            <w:r>
+              <w:t>1. Login as staff with incomplete_clock_out_count &gt; 0.</w:t>
+            </w:r>
+          </w:p>
+        </w:tc>
+        <w:tc>
+          <w:tcPr>
+            <w:tcW w:type="dxa" w:w="1440"/>
+          </w:tcPr>
+          <w:p>
+            <w:r>
+              <w:t>AttendanceWarningsWidget appears on dashboard.</w:t>
+            </w:r>
+          </w:p>
+        </w:tc>
+        <w:tc>
+          <w:tcPr>
+            <w:tcW w:type="dxa" w:w="1440"/>
+          </w:tcPr>
+          <w:p>
+            <w:r>
+              <w:t>Warning widget displayed with correct infraction count.</w:t>
+            </w:r>
+          </w:p>
+        </w:tc>
+        <w:tc>
+          <w:tcPr>
+            <w:tcW w:type="dxa" w:w="1440"/>
+          </w:tcPr>
+          <w:p>
+            <w:r>
+              <w:t>PASS</w:t>
+            </w:r>
+          </w:p>
+        </w:tc>
+      </w:tr>
+      <w:tr>
+        <w:tc>
+          <w:tcPr>
+            <w:tcW w:type="dxa" w:w="1440"/>
+          </w:tcPr>
+          <w:p>
+            <w:r>
+              <w:t>TC-S06</w:t>
+            </w:r>
+          </w:p>
+        </w:tc>
+        <w:tc>
+          <w:tcPr>
+            <w:tcW w:type="dxa" w:w="1440"/>
+          </w:tcPr>
+          <w:p>
+            <w:r>
+              <w:t>Log vehicle mileage</w:t>
+            </w:r>
+          </w:p>
+        </w:tc>
+        <w:tc>
+          <w:tcPr>
+            <w:tcW w:type="dxa" w:w="1440"/>
+          </w:tcPr>
+          <w:p>
+            <w:r>
+              <w:t>1. Navigate to "Mileage Logs".</w:t>
+              <w:br/>
+              <w:t>2. Click New.</w:t>
+              <w:br/>
+              <w:t>3. Enter vehicle, mileage, date.</w:t>
+            </w:r>
+          </w:p>
+        </w:tc>
+        <w:tc>
+          <w:tcPr>
+            <w:tcW w:type="dxa" w:w="1440"/>
+          </w:tcPr>
+          <w:p>
+            <w:r>
+              <w:t>Mileage log record saved.</w:t>
+            </w:r>
+          </w:p>
+        </w:tc>
+        <w:tc>
+          <w:tcPr>
+            <w:tcW w:type="dxa" w:w="1440"/>
+          </w:tcPr>
+          <w:p>
+            <w:r>
+              <w:t>Record saved; mileage reflected in vehicle list.</w:t>
+            </w:r>
+          </w:p>
+        </w:tc>
+        <w:tc>
+          <w:tcPr>
+            <w:tcW w:type="dxa" w:w="1440"/>
+          </w:tcPr>
+          <w:p>
+            <w:r>
+              <w:t>PASS</w:t>
+            </w:r>
+          </w:p>
+        </w:tc>
+      </w:tr>
+    </w:tbl>
+    <w:p/>
+    <w:p>
+      <w:pPr>
+        <w:pStyle w:val="Heading3"/>
+      </w:pPr>
+      <w:r>
+        <w:t>5.4.2  UAT – Manager Role</w:t>
+      </w:r>
+    </w:p>
+    <w:tbl>
+      <w:tblPr>
+        <w:tblStyle w:val="TableGrid"/>
+        <w:tblW w:type="auto" w:w="0"/>
+        <w:tblLook w:firstColumn="1" w:firstRow="1" w:lastColumn="0" w:lastRow="0" w:noHBand="0" w:noVBand="1" w:val="04A0"/>
+      </w:tblPr>
+      <w:tblGrid>
+        <w:gridCol w:w="1440"/>
+        <w:gridCol w:w="1440"/>
+        <w:gridCol w:w="1440"/>
+        <w:gridCol w:w="1440"/>
+        <w:gridCol w:w="1440"/>
+        <w:gridCol w:w="1440"/>
+      </w:tblGrid>
+      <w:tr>
+        <w:tc>
+          <w:tcPr>
+            <w:tcW w:type="dxa" w:w="1440"/>
+          </w:tcPr>
+          <w:p>
+            <w:r>
+              <w:rPr>
+                <w:b/>
+              </w:rPr>
+              <w:t>TC</w:t>
+            </w:r>
+          </w:p>
+        </w:tc>
+        <w:tc>
+          <w:tcPr>
+            <w:tcW w:type="dxa" w:w="1440"/>
+          </w:tcPr>
+          <w:p>
+            <w:r>
+              <w:rPr>
+                <w:b/>
+              </w:rPr>
+              <w:t>Test Case</w:t>
+            </w:r>
+          </w:p>
+        </w:tc>
+        <w:tc>
+          <w:tcPr>
+            <w:tcW w:type="dxa" w:w="1440"/>
+          </w:tcPr>
+          <w:p>
+            <w:r>
+              <w:rPr>
+                <w:b/>
+              </w:rPr>
+              <w:t>Steps</w:t>
+            </w:r>
+          </w:p>
+        </w:tc>
+        <w:tc>
+          <w:tcPr>
+            <w:tcW w:type="dxa" w:w="1440"/>
+          </w:tcPr>
+          <w:p>
+            <w:r>
+              <w:rPr>
+                <w:b/>
+              </w:rPr>
+              <w:t>Expected Result</w:t>
+            </w:r>
+          </w:p>
+        </w:tc>
+        <w:tc>
+          <w:tcPr>
+            <w:tcW w:type="dxa" w:w="1440"/>
+          </w:tcPr>
+          <w:p>
+            <w:r>
+              <w:rPr>
+                <w:b/>
+              </w:rPr>
+              <w:t>Actual Result</w:t>
+            </w:r>
+          </w:p>
+        </w:tc>
+        <w:tc>
+          <w:tcPr>
+            <w:tcW w:type="dxa" w:w="1440"/>
+          </w:tcPr>
+          <w:p>
+            <w:r>
+              <w:rPr>
+                <w:b/>
+              </w:rPr>
+              <w:t>Status</w:t>
+            </w:r>
+          </w:p>
+        </w:tc>
+      </w:tr>
+      <w:tr>
+        <w:tc>
+          <w:tcPr>
+            <w:tcW w:type="dxa" w:w="1440"/>
+          </w:tcPr>
+          <w:p/>
+        </w:tc>
+        <w:tc>
+          <w:tcPr>
+            <w:tcW w:type="dxa" w:w="1440"/>
+          </w:tcPr>
+          <w:p/>
+        </w:tc>
+        <w:tc>
+          <w:tcPr>
+            <w:tcW w:type="dxa" w:w="1440"/>
+          </w:tcPr>
+          <w:p/>
+        </w:tc>
+        <w:tc>
+          <w:tcPr>
+            <w:tcW w:type="dxa" w:w="1440"/>
+          </w:tcPr>
+          <w:p/>
+        </w:tc>
+        <w:tc>
+          <w:tcPr>
+            <w:tcW w:type="dxa" w:w="1440"/>
+          </w:tcPr>
+          <w:p/>
+        </w:tc>
+        <w:tc>
+          <w:tcPr>
+            <w:tcW w:type="dxa" w:w="1440"/>
+          </w:tcPr>
+          <w:p/>
+        </w:tc>
+      </w:tr>
+      <w:tr>
+        <w:tc>
+          <w:tcPr>
+            <w:tcW w:type="dxa" w:w="1440"/>
+          </w:tcPr>
+          <w:p/>
+        </w:tc>
+        <w:tc>
+          <w:tcPr>
+            <w:tcW w:type="dxa" w:w="1440"/>
+          </w:tcPr>
+          <w:p/>
+        </w:tc>
+        <w:tc>
+          <w:tcPr>
+            <w:tcW w:type="dxa" w:w="1440"/>
+          </w:tcPr>
+          <w:p/>
+        </w:tc>
+        <w:tc>
+          <w:tcPr>
+            <w:tcW w:type="dxa" w:w="1440"/>
+          </w:tcPr>
+          <w:p/>
+        </w:tc>
+        <w:tc>
+          <w:tcPr>
+            <w:tcW w:type="dxa" w:w="1440"/>
+          </w:tcPr>
+          <w:p/>
+        </w:tc>
+        <w:tc>
+          <w:tcPr>
+            <w:tcW w:type="dxa" w:w="1440"/>
+          </w:tcPr>
+          <w:p/>
+        </w:tc>
+      </w:tr>
+      <w:tr>
+        <w:tc>
+          <w:tcPr>
+            <w:tcW w:type="dxa" w:w="1440"/>
+          </w:tcPr>
+          <w:p/>
+        </w:tc>
+        <w:tc>
+          <w:tcPr>
+            <w:tcW w:type="dxa" w:w="1440"/>
+          </w:tcPr>
+          <w:p/>
+        </w:tc>
+        <w:tc>
+          <w:tcPr>
+            <w:tcW w:type="dxa" w:w="1440"/>
+          </w:tcPr>
+          <w:p/>
+        </w:tc>
+        <w:tc>
+          <w:tcPr>
+            <w:tcW w:type="dxa" w:w="1440"/>
+          </w:tcPr>
+          <w:p/>
+        </w:tc>
+        <w:tc>
+          <w:tcPr>
+            <w:tcW w:type="dxa" w:w="1440"/>
+          </w:tcPr>
+          <w:p/>
+        </w:tc>
+        <w:tc>
+          <w:tcPr>
+            <w:tcW w:type="dxa" w:w="1440"/>
+          </w:tcPr>
+          <w:p/>
+        </w:tc>
+      </w:tr>
+      <w:tr>
+        <w:tc>
+          <w:tcPr>
+            <w:tcW w:type="dxa" w:w="1440"/>
+          </w:tcPr>
+          <w:p/>
+        </w:tc>
+        <w:tc>
+          <w:tcPr>
+            <w:tcW w:type="dxa" w:w="1440"/>
+          </w:tcPr>
+          <w:p/>
+        </w:tc>
+        <w:tc>
+          <w:tcPr>
+            <w:tcW w:type="dxa" w:w="1440"/>
+          </w:tcPr>
+          <w:p/>
+        </w:tc>
+        <w:tc>
+          <w:tcPr>
+            <w:tcW w:type="dxa" w:w="1440"/>
+          </w:tcPr>
+          <w:p/>
+        </w:tc>
+        <w:tc>
+          <w:tcPr>
+            <w:tcW w:type="dxa" w:w="1440"/>
+          </w:tcPr>
+          <w:p/>
+        </w:tc>
+        <w:tc>
+          <w:tcPr>
+            <w:tcW w:type="dxa" w:w="1440"/>
+          </w:tcPr>
+          <w:p/>
+        </w:tc>
+      </w:tr>
+      <w:tr>
+        <w:tc>
+          <w:tcPr>
+            <w:tcW w:type="dxa" w:w="1440"/>
+          </w:tcPr>
+          <w:p>
+            <w:r>
+              <w:t>TC-M01</w:t>
+            </w:r>
+          </w:p>
+        </w:tc>
+        <w:tc>
+          <w:tcPr>
+            <w:tcW w:type="dxa" w:w="1440"/>
+          </w:tcPr>
+          <w:p>
+            <w:r>
+              <w:t>View team attendance overview widget</w:t>
+            </w:r>
+          </w:p>
+        </w:tc>
+        <w:tc>
+          <w:tcPr>
+            <w:tcW w:type="dxa" w:w="1440"/>
+          </w:tcPr>
+          <w:p>
+            <w:r>
+              <w:t>1. Login as Manager.</w:t>
+              <w:br/>
+              <w:t>2. View dashboard.</w:t>
+            </w:r>
+          </w:p>
+        </w:tc>
+        <w:tc>
+          <w:tcPr>
+            <w:tcW w:type="dxa" w:w="1440"/>
+          </w:tcPr>
+          <w:p>
+            <w:r>
+              <w:t>Widget shows present, absent, late, overtime counts for current operational day.</w:t>
+            </w:r>
+          </w:p>
+        </w:tc>
+        <w:tc>
+          <w:tcPr>
+            <w:tcW w:type="dxa" w:w="1440"/>
+          </w:tcPr>
+          <w:p>
+            <w:r>
+              <w:t>Stats displayed correctly; not visible to Staff.</w:t>
+            </w:r>
+          </w:p>
+        </w:tc>
+        <w:tc>
+          <w:tcPr>
+            <w:tcW w:type="dxa" w:w="1440"/>
+          </w:tcPr>
+          <w:p>
+            <w:r>
+              <w:t>PASS</w:t>
+            </w:r>
+          </w:p>
+        </w:tc>
+      </w:tr>
+      <w:tr>
+        <w:tc>
+          <w:tcPr>
+            <w:tcW w:type="dxa" w:w="1440"/>
+          </w:tcPr>
+          <w:p>
+            <w:r>
+              <w:t>TC-M02</w:t>
+            </w:r>
+          </w:p>
+        </w:tc>
+        <w:tc>
+          <w:tcPr>
+            <w:tcW w:type="dxa" w:w="1440"/>
+          </w:tcPr>
+          <w:p>
+            <w:r>
+              <w:t>Approve pending attendance record</w:t>
+            </w:r>
+          </w:p>
+        </w:tc>
+        <w:tc>
+          <w:tcPr>
+            <w:tcW w:type="dxa" w:w="1440"/>
+          </w:tcPr>
+          <w:p>
+            <w:r>
+              <w:t>1. Navigate to "Attendance Approval".</w:t>
+              <w:br/>
+              <w:t>2. Select pending record.</w:t>
+              <w:br/>
+              <w:t>3. Click Approve.</w:t>
+            </w:r>
+          </w:p>
+        </w:tc>
+        <w:tc>
+          <w:tcPr>
+            <w:tcW w:type="dxa" w:w="1440"/>
+          </w:tcPr>
+          <w:p>
+            <w:r>
+              <w:t>Record status → "verified". approved_by and approved_at populated.</w:t>
+            </w:r>
+          </w:p>
+        </w:tc>
+        <w:tc>
+          <w:tcPr>
+            <w:tcW w:type="dxa" w:w="1440"/>
+          </w:tcPr>
+          <w:p>
+            <w:r>
+              <w:t>Status updated to verified; audit fields saved.</w:t>
+            </w:r>
+          </w:p>
+        </w:tc>
+        <w:tc>
+          <w:tcPr>
+            <w:tcW w:type="dxa" w:w="1440"/>
+          </w:tcPr>
+          <w:p>
+            <w:r>
+              <w:t>PASS</w:t>
+            </w:r>
+          </w:p>
+        </w:tc>
+      </w:tr>
+      <w:tr>
+        <w:tc>
+          <w:tcPr>
+            <w:tcW w:type="dxa" w:w="1440"/>
+          </w:tcPr>
+          <w:p>
+            <w:r>
+              <w:t>TC-M03</w:t>
+            </w:r>
+          </w:p>
+        </w:tc>
+        <w:tc>
+          <w:tcPr>
+            <w:tcW w:type="dxa" w:w="1440"/>
+          </w:tcPr>
+          <w:p>
+            <w:r>
+              <w:t>Reject attendance record</w:t>
+            </w:r>
+          </w:p>
+        </w:tc>
+        <w:tc>
+          <w:tcPr>
+            <w:tcW w:type="dxa" w:w="1440"/>
+          </w:tcPr>
+          <w:p>
+            <w:r>
+              <w:t>1. In "Attendance Approval", select pending record.</w:t>
+              <w:br/>
+              <w:t>2. Click Reject.</w:t>
+            </w:r>
+          </w:p>
+        </w:tc>
+        <w:tc>
+          <w:tcPr>
+            <w:tcW w:type="dxa" w:w="1440"/>
+          </w:tcPr>
+          <w:p>
+            <w:r>
+              <w:t>Record status → "rejected".</w:t>
+            </w:r>
+          </w:p>
+        </w:tc>
+        <w:tc>
+          <w:tcPr>
+            <w:tcW w:type="dxa" w:w="1440"/>
+          </w:tcPr>
+          <w:p>
+            <w:r>
+              <w:t>Status updated to rejected.</w:t>
+            </w:r>
+          </w:p>
+        </w:tc>
+        <w:tc>
+          <w:tcPr>
+            <w:tcW w:type="dxa" w:w="1440"/>
+          </w:tcPr>
+          <w:p>
+            <w:r>
+              <w:t>PASS</w:t>
+            </w:r>
+          </w:p>
+        </w:tc>
+      </w:tr>
+      <w:tr>
+        <w:tc>
+          <w:tcPr>
+            <w:tcW w:type="dxa" w:w="1440"/>
+          </w:tcPr>
+          <w:p>
+            <w:r>
+              <w:t>TC-M04</w:t>
+            </w:r>
+          </w:p>
+        </w:tc>
+        <w:tc>
+          <w:tcPr>
+            <w:tcW w:type="dxa" w:w="1440"/>
+          </w:tcPr>
+          <w:p>
+            <w:r>
+              <w:t>Manager cannot access Admin Panel</w:t>
+            </w:r>
+          </w:p>
+        </w:tc>
+        <w:tc>
+          <w:tcPr>
+            <w:tcW w:type="dxa" w:w="1440"/>
+          </w:tcPr>
+          <w:p>
+            <w:r>
+              <w:t>1. Login as Manager.</w:t>
+              <w:br/>
+              <w:t>2. Attempt to navigate to /admin.</w:t>
+            </w:r>
+          </w:p>
+        </w:tc>
+        <w:tc>
+          <w:tcPr>
+            <w:tcW w:type="dxa" w:w="1440"/>
+          </w:tcPr>
+          <w:p>
+            <w:r>
+              <w:t>Access denied; redirect to login or 403.</w:t>
+            </w:r>
+          </w:p>
+        </w:tc>
+        <w:tc>
+          <w:tcPr>
+            <w:tcW w:type="dxa" w:w="1440"/>
+          </w:tcPr>
+          <w:p>
+            <w:r>
+              <w:t>canAccessPanel() returned false; redirected.</w:t>
+            </w:r>
+          </w:p>
+        </w:tc>
+        <w:tc>
+          <w:tcPr>
+            <w:tcW w:type="dxa" w:w="1440"/>
+          </w:tcPr>
+          <w:p>
+            <w:r>
+              <w:t>PASS</w:t>
+            </w:r>
+          </w:p>
+        </w:tc>
+      </w:tr>
+    </w:tbl>
+    <w:p/>
+    <w:p>
+      <w:pPr>
+        <w:pStyle w:val="Heading3"/>
+      </w:pPr>
+      <w:r>
+        <w:t>5.4.3  UAT – Admin Role</w:t>
+      </w:r>
+    </w:p>
+    <w:tbl>
+      <w:tblPr>
+        <w:tblStyle w:val="TableGrid"/>
+        <w:tblW w:type="auto" w:w="0"/>
+        <w:tblLook w:firstColumn="1" w:firstRow="1" w:lastColumn="0" w:lastRow="0" w:noHBand="0" w:noVBand="1" w:val="04A0"/>
+      </w:tblPr>
+      <w:tblGrid>
+        <w:gridCol w:w="1440"/>
+        <w:gridCol w:w="1440"/>
+        <w:gridCol w:w="1440"/>
+        <w:gridCol w:w="1440"/>
+        <w:gridCol w:w="1440"/>
+        <w:gridCol w:w="1440"/>
+      </w:tblGrid>
+      <w:tr>
+        <w:tc>
+          <w:tcPr>
+            <w:tcW w:type="dxa" w:w="1440"/>
+          </w:tcPr>
+          <w:p>
+            <w:r>
+              <w:rPr>
+                <w:b/>
+              </w:rPr>
+              <w:t>TC</w:t>
+            </w:r>
+          </w:p>
+        </w:tc>
+        <w:tc>
+          <w:tcPr>
+            <w:tcW w:type="dxa" w:w="1440"/>
+          </w:tcPr>
+          <w:p>
+            <w:r>
+              <w:rPr>
+                <w:b/>
+              </w:rPr>
+              <w:t>Test Case</w:t>
+            </w:r>
+          </w:p>
+        </w:tc>
+        <w:tc>
+          <w:tcPr>
+            <w:tcW w:type="dxa" w:w="1440"/>
+          </w:tcPr>
+          <w:p>
+            <w:r>
+              <w:rPr>
+                <w:b/>
+              </w:rPr>
+              <w:t>Steps</w:t>
+            </w:r>
+          </w:p>
+        </w:tc>
+        <w:tc>
+          <w:tcPr>
+            <w:tcW w:type="dxa" w:w="1440"/>
+          </w:tcPr>
+          <w:p>
+            <w:r>
+              <w:rPr>
+                <w:b/>
+              </w:rPr>
+              <w:t>Expected Result</w:t>
+            </w:r>
+          </w:p>
+        </w:tc>
+        <w:tc>
+          <w:tcPr>
+            <w:tcW w:type="dxa" w:w="1440"/>
+          </w:tcPr>
+          <w:p>
+            <w:r>
+              <w:rPr>
+                <w:b/>
+              </w:rPr>
+              <w:t>Actual Result</w:t>
+            </w:r>
+          </w:p>
+        </w:tc>
+        <w:tc>
+          <w:tcPr>
+            <w:tcW w:type="dxa" w:w="1440"/>
+          </w:tcPr>
+          <w:p>
+            <w:r>
+              <w:rPr>
+                <w:b/>
+              </w:rPr>
+              <w:t>Status</w:t>
+            </w:r>
+          </w:p>
+        </w:tc>
+      </w:tr>
+      <w:tr>
+        <w:tc>
+          <w:tcPr>
+            <w:tcW w:type="dxa" w:w="1440"/>
+          </w:tcPr>
+          <w:p/>
+        </w:tc>
+        <w:tc>
+          <w:tcPr>
+            <w:tcW w:type="dxa" w:w="1440"/>
+          </w:tcPr>
+          <w:p/>
+        </w:tc>
+        <w:tc>
+          <w:tcPr>
+            <w:tcW w:type="dxa" w:w="1440"/>
+          </w:tcPr>
+          <w:p/>
+        </w:tc>
+        <w:tc>
+          <w:tcPr>
+            <w:tcW w:type="dxa" w:w="1440"/>
+          </w:tcPr>
+          <w:p/>
+        </w:tc>
+        <w:tc>
+          <w:tcPr>
+            <w:tcW w:type="dxa" w:w="1440"/>
+          </w:tcPr>
+          <w:p/>
+        </w:tc>
+        <w:tc>
+          <w:tcPr>
+            <w:tcW w:type="dxa" w:w="1440"/>
+          </w:tcPr>
+          <w:p/>
+        </w:tc>
+      </w:tr>
+      <w:tr>
+        <w:tc>
+          <w:tcPr>
+            <w:tcW w:type="dxa" w:w="1440"/>
+          </w:tcPr>
+          <w:p/>
+        </w:tc>
+        <w:tc>
+          <w:tcPr>
+            <w:tcW w:type="dxa" w:w="1440"/>
+          </w:tcPr>
+          <w:p/>
+        </w:tc>
+        <w:tc>
+          <w:tcPr>
+            <w:tcW w:type="dxa" w:w="1440"/>
+          </w:tcPr>
+          <w:p/>
+        </w:tc>
+        <w:tc>
+          <w:tcPr>
+            <w:tcW w:type="dxa" w:w="1440"/>
+          </w:tcPr>
+          <w:p/>
+        </w:tc>
+        <w:tc>
+          <w:tcPr>
+            <w:tcW w:type="dxa" w:w="1440"/>
+          </w:tcPr>
+          <w:p/>
+        </w:tc>
+        <w:tc>
+          <w:tcPr>
+            <w:tcW w:type="dxa" w:w="1440"/>
+          </w:tcPr>
+          <w:p/>
+        </w:tc>
+      </w:tr>
+      <w:tr>
+        <w:tc>
+          <w:tcPr>
+            <w:tcW w:type="dxa" w:w="1440"/>
+          </w:tcPr>
+          <w:p/>
+        </w:tc>
+        <w:tc>
+          <w:tcPr>
+            <w:tcW w:type="dxa" w:w="1440"/>
+          </w:tcPr>
+          <w:p/>
+        </w:tc>
+        <w:tc>
+          <w:tcPr>
+            <w:tcW w:type="dxa" w:w="1440"/>
+          </w:tcPr>
+          <w:p/>
+        </w:tc>
+        <w:tc>
+          <w:tcPr>
+            <w:tcW w:type="dxa" w:w="1440"/>
+          </w:tcPr>
+          <w:p/>
+        </w:tc>
+        <w:tc>
+          <w:tcPr>
+            <w:tcW w:type="dxa" w:w="1440"/>
+          </w:tcPr>
+          <w:p/>
+        </w:tc>
+        <w:tc>
+          <w:tcPr>
+            <w:tcW w:type="dxa" w:w="1440"/>
+          </w:tcPr>
+          <w:p/>
+        </w:tc>
+      </w:tr>
+      <w:tr>
+        <w:tc>
+          <w:tcPr>
+            <w:tcW w:type="dxa" w:w="1440"/>
+          </w:tcPr>
+          <w:p/>
+        </w:tc>
+        <w:tc>
+          <w:tcPr>
+            <w:tcW w:type="dxa" w:w="1440"/>
+          </w:tcPr>
+          <w:p/>
+        </w:tc>
+        <w:tc>
+          <w:tcPr>
+            <w:tcW w:type="dxa" w:w="1440"/>
+          </w:tcPr>
+          <w:p/>
+        </w:tc>
+        <w:tc>
+          <w:tcPr>
+            <w:tcW w:type="dxa" w:w="1440"/>
+          </w:tcPr>
+          <w:p/>
+        </w:tc>
+        <w:tc>
+          <w:tcPr>
+            <w:tcW w:type="dxa" w:w="1440"/>
+          </w:tcPr>
+          <w:p/>
+        </w:tc>
+        <w:tc>
+          <w:tcPr>
+            <w:tcW w:type="dxa" w:w="1440"/>
+          </w:tcPr>
+          <w:p/>
+        </w:tc>
+      </w:tr>
+      <w:tr>
+        <w:tc>
+          <w:tcPr>
+            <w:tcW w:type="dxa" w:w="1440"/>
+          </w:tcPr>
+          <w:p/>
+        </w:tc>
+        <w:tc>
+          <w:tcPr>
+            <w:tcW w:type="dxa" w:w="1440"/>
+          </w:tcPr>
+          <w:p/>
+        </w:tc>
+        <w:tc>
+          <w:tcPr>
+            <w:tcW w:type="dxa" w:w="1440"/>
+          </w:tcPr>
+          <w:p/>
+        </w:tc>
+        <w:tc>
+          <w:tcPr>
+            <w:tcW w:type="dxa" w:w="1440"/>
+          </w:tcPr>
+          <w:p/>
+        </w:tc>
+        <w:tc>
+          <w:tcPr>
+            <w:tcW w:type="dxa" w:w="1440"/>
+          </w:tcPr>
+          <w:p/>
+        </w:tc>
+        <w:tc>
+          <w:tcPr>
+            <w:tcW w:type="dxa" w:w="1440"/>
+          </w:tcPr>
+          <w:p/>
+        </w:tc>
+      </w:tr>
+      <w:tr>
+        <w:tc>
+          <w:tcPr>
+            <w:tcW w:type="dxa" w:w="1440"/>
+          </w:tcPr>
+          <w:p/>
+        </w:tc>
+        <w:tc>
+          <w:tcPr>
+            <w:tcW w:type="dxa" w:w="1440"/>
+          </w:tcPr>
+          <w:p/>
+        </w:tc>
+        <w:tc>
+          <w:tcPr>
+            <w:tcW w:type="dxa" w:w="1440"/>
+          </w:tcPr>
+          <w:p/>
+        </w:tc>
+        <w:tc>
+          <w:tcPr>
+            <w:tcW w:type="dxa" w:w="1440"/>
+          </w:tcPr>
+          <w:p/>
+        </w:tc>
+        <w:tc>
+          <w:tcPr>
+            <w:tcW w:type="dxa" w:w="1440"/>
+          </w:tcPr>
+          <w:p/>
+        </w:tc>
+        <w:tc>
+          <w:tcPr>
+            <w:tcW w:type="dxa" w:w="1440"/>
+          </w:tcPr>
+          <w:p/>
+        </w:tc>
+      </w:tr>
+      <w:tr>
+        <w:tc>
+          <w:tcPr>
+            <w:tcW w:type="dxa" w:w="1440"/>
+          </w:tcPr>
+          <w:p>
+            <w:r>
+              <w:t>TC-AD01</w:t>
+            </w:r>
+          </w:p>
+        </w:tc>
+        <w:tc>
+          <w:tcPr>
+            <w:tcW w:type="dxa" w:w="1440"/>
+          </w:tcPr>
+          <w:p>
+            <w:r>
+              <w:t>Create new user account</w:t>
+            </w:r>
+          </w:p>
+        </w:tc>
+        <w:tc>
+          <w:tcPr>
+            <w:tcW w:type="dxa" w:w="1440"/>
+          </w:tcPr>
+          <w:p>
+            <w:r>
+              <w:t>1. Login as Admin.</w:t>
+              <w:br/>
+              <w:t>2. Navigate to Users.</w:t>
+              <w:br/>
+              <w:t>3. Create user with name, phone, role.</w:t>
+            </w:r>
+          </w:p>
+        </w:tc>
+        <w:tc>
+          <w:tcPr>
+            <w:tcW w:type="dxa" w:w="1440"/>
+          </w:tcPr>
+          <w:p>
+            <w:r>
+              <w:t>User record created. User can login with assigned credentials.</w:t>
+            </w:r>
+          </w:p>
+        </w:tc>
+        <w:tc>
+          <w:tcPr>
+            <w:tcW w:type="dxa" w:w="1440"/>
+          </w:tcPr>
+          <w:p>
+            <w:r>
+              <w:t>User created; login confirmed.</w:t>
+            </w:r>
+          </w:p>
+        </w:tc>
+        <w:tc>
+          <w:tcPr>
+            <w:tcW w:type="dxa" w:w="1440"/>
+          </w:tcPr>
+          <w:p>
+            <w:r>
+              <w:t>PASS</w:t>
+            </w:r>
+          </w:p>
+        </w:tc>
+      </w:tr>
+      <w:tr>
+        <w:tc>
+          <w:tcPr>
+            <w:tcW w:type="dxa" w:w="1440"/>
+          </w:tcPr>
+          <w:p>
+            <w:r>
+              <w:t>TC-AD02</w:t>
+            </w:r>
+          </w:p>
+        </w:tc>
+        <w:tc>
+          <w:tcPr>
+            <w:tcW w:type="dxa" w:w="1440"/>
+          </w:tcPr>
+          <w:p>
+            <w:r>
+              <w:t>Create new site with GPS and IP</w:t>
+            </w:r>
+          </w:p>
+        </w:tc>
+        <w:tc>
+          <w:tcPr>
+            <w:tcW w:type="dxa" w:w="1440"/>
+          </w:tcPr>
+          <w:p>
+            <w:r>
+              <w:t>1. Navigate to Sites.</w:t>
+              <w:br/>
+              <w:t>2. Create site with coordinates, radius, IP.</w:t>
+            </w:r>
+          </w:p>
+        </w:tc>
+        <w:tc>
+          <w:tcPr>
+            <w:tcW w:type="dxa" w:w="1440"/>
+          </w:tcPr>
+          <w:p>
+            <w:r>
+              <w:t>Site saved. Verification uses new site in subsequent clock-ins.</w:t>
+            </w:r>
+          </w:p>
+        </w:tc>
+        <w:tc>
+          <w:tcPr>
+            <w:tcW w:type="dxa" w:w="1440"/>
+          </w:tcPr>
+          <w:p>
+            <w:r>
+              <w:t>Site saved; matched on next clock-in.</w:t>
+            </w:r>
+          </w:p>
+        </w:tc>
+        <w:tc>
+          <w:tcPr>
+            <w:tcW w:type="dxa" w:w="1440"/>
+          </w:tcPr>
+          <w:p>
+            <w:r>
+              <w:t>PASS</w:t>
+            </w:r>
+          </w:p>
+        </w:tc>
+      </w:tr>
+      <w:tr>
+        <w:tc>
+          <w:tcPr>
+            <w:tcW w:type="dxa" w:w="1440"/>
+          </w:tcPr>
+          <w:p>
+            <w:r>
+              <w:t>TC-AD03</w:t>
+            </w:r>
+          </w:p>
+        </w:tc>
+        <w:tc>
+          <w:tcPr>
+            <w:tcW w:type="dxa" w:w="1440"/>
+          </w:tcPr>
+          <w:p>
+            <w:r>
+              <w:t>Export attendance as CSV</w:t>
+            </w:r>
+          </w:p>
+        </w:tc>
+        <w:tc>
+          <w:tcPr>
+            <w:tcW w:type="dxa" w:w="1440"/>
+          </w:tcPr>
+          <w:p>
+            <w:r>
+              <w:t>1. Navigate to /attendance/export.</w:t>
+            </w:r>
+          </w:p>
+        </w:tc>
+        <w:tc>
+          <w:tcPr>
+            <w:tcW w:type="dxa" w:w="1440"/>
+          </w:tcPr>
+          <w:p>
+            <w:r>
+              <w:t>CSV file downloaded with attendance records.</w:t>
+            </w:r>
+          </w:p>
+        </w:tc>
+        <w:tc>
+          <w:tcPr>
+            <w:tcW w:type="dxa" w:w="1440"/>
+          </w:tcPr>
+          <w:p>
+            <w:r>
+              <w:t>CSV generated and downloaded correctly.</w:t>
+            </w:r>
+          </w:p>
+        </w:tc>
+        <w:tc>
+          <w:tcPr>
+            <w:tcW w:type="dxa" w:w="1440"/>
+          </w:tcPr>
+          <w:p>
+            <w:r>
+              <w:t>PASS</w:t>
+            </w:r>
+          </w:p>
+        </w:tc>
+      </w:tr>
+      <w:tr>
+        <w:tc>
+          <w:tcPr>
+            <w:tcW w:type="dxa" w:w="1440"/>
+          </w:tcPr>
+          <w:p>
+            <w:r>
+              <w:t>TC-AD04</w:t>
+            </w:r>
+          </w:p>
+        </w:tc>
+        <w:tc>
+          <w:tcPr>
+            <w:tcW w:type="dxa" w:w="1440"/>
+          </w:tcPr>
+          <w:p>
+            <w:r>
+              <w:t>Print attendance report</w:t>
+            </w:r>
+          </w:p>
+        </w:tc>
+        <w:tc>
+          <w:tcPr>
+            <w:tcW w:type="dxa" w:w="1440"/>
+          </w:tcPr>
+          <w:p>
+            <w:r>
+              <w:t>1. Navigate to /attendance/print.</w:t>
+            </w:r>
+          </w:p>
+        </w:tc>
+        <w:tc>
+          <w:tcPr>
+            <w:tcW w:type="dxa" w:w="1440"/>
+          </w:tcPr>
+          <w:p>
+            <w:r>
+              <w:t>Print-ready HTML page rendered.</w:t>
+            </w:r>
+          </w:p>
+        </w:tc>
+        <w:tc>
+          <w:tcPr>
+            <w:tcW w:type="dxa" w:w="1440"/>
+          </w:tcPr>
+          <w:p>
+            <w:r>
+              <w:t>Print view rendered with full data table.</w:t>
+            </w:r>
+          </w:p>
+        </w:tc>
+        <w:tc>
+          <w:tcPr>
+            <w:tcW w:type="dxa" w:w="1440"/>
+          </w:tcPr>
+          <w:p>
+            <w:r>
+              <w:t>PASS</w:t>
+            </w:r>
+          </w:p>
+        </w:tc>
+      </w:tr>
+      <w:tr>
+        <w:tc>
+          <w:tcPr>
+            <w:tcW w:type="dxa" w:w="1440"/>
+          </w:tcPr>
+          <w:p>
+            <w:r>
+              <w:t>TC-AD05</w:t>
+            </w:r>
+          </w:p>
+        </w:tc>
+        <w:tc>
+          <w:tcPr>
+            <w:tcW w:type="dxa" w:w="1440"/>
+          </w:tcPr>
+          <w:p>
+            <w:r>
+              <w:t>Register new vehicle and verify service alert</w:t>
+            </w:r>
+          </w:p>
+        </w:tc>
+        <w:tc>
+          <w:tcPr>
+            <w:tcW w:type="dxa" w:w="1440"/>
+          </w:tcPr>
+          <w:p>
+            <w:r>
+              <w:t>1. Navigate to Vehicles.</w:t>
+              <w:br/>
+              <w:t>2. Create vehicle; set next_service_mileage near current.</w:t>
+            </w:r>
+          </w:p>
+        </w:tc>
+        <w:tc>
+          <w:tcPr>
+            <w:tcW w:type="dxa" w:w="1440"/>
+          </w:tcPr>
+          <w:p>
+            <w:r>
+              <w:t>Vehicle created. Alert fires when within 500 km threshold.</w:t>
+            </w:r>
+          </w:p>
+        </w:tc>
+        <w:tc>
+          <w:tcPr>
+            <w:tcW w:type="dxa" w:w="1440"/>
+          </w:tcPr>
+          <w:p>
+            <w:r>
+              <w:t>Alert triggered correctly.</w:t>
+            </w:r>
+          </w:p>
+        </w:tc>
+        <w:tc>
+          <w:tcPr>
+            <w:tcW w:type="dxa" w:w="1440"/>
+          </w:tcPr>
+          <w:p>
+            <w:r>
+              <w:t>PASS</w:t>
+            </w:r>
+          </w:p>
+        </w:tc>
+      </w:tr>
+      <w:tr>
+        <w:tc>
+          <w:tcPr>
+            <w:tcW w:type="dxa" w:w="1440"/>
+          </w:tcPr>
+          <w:p>
+            <w:r>
+              <w:t>TC-AD06</w:t>
+            </w:r>
+          </w:p>
+        </w:tc>
+        <w:tc>
+          <w:tcPr>
+            <w:tcW w:type="dxa" w:w="1440"/>
+          </w:tcPr>
+          <w:p>
+            <w:r>
+              <w:t>Admin cannot access Staff Panel</w:t>
+            </w:r>
+          </w:p>
+        </w:tc>
+        <w:tc>
+          <w:tcPr>
+            <w:tcW w:type="dxa" w:w="1440"/>
+          </w:tcPr>
+          <w:p>
+            <w:r>
+              <w:t>1. Login as Admin.</w:t>
+              <w:br/>
+              <w:t>2. Attempt to navigate to /staff.</w:t>
+            </w:r>
+          </w:p>
+        </w:tc>
+        <w:tc>
+          <w:tcPr>
+            <w:tcW w:type="dxa" w:w="1440"/>
+          </w:tcPr>
+          <w:p>
+            <w:r>
+              <w:t>Access denied; canAccessPanel() returns false.</w:t>
+            </w:r>
+          </w:p>
+        </w:tc>
+        <w:tc>
+          <w:tcPr>
+            <w:tcW w:type="dxa" w:w="1440"/>
+          </w:tcPr>
+          <w:p>
+            <w:r>
+              <w:t>Admin blocked from staff panel.</w:t>
+            </w:r>
+          </w:p>
+        </w:tc>
+        <w:tc>
+          <w:tcPr>
+            <w:tcW w:type="dxa" w:w="1440"/>
+          </w:tcPr>
+          <w:p>
+            <w:r>
+              <w:t>PASS</w:t>
+            </w:r>
+          </w:p>
+        </w:tc>
+      </w:tr>
+    </w:tbl>
+    <w:p/>
+    <w:p>
+      <w:pPr>
+        <w:pStyle w:val="Heading2"/>
+      </w:pPr>
+      <w:r>
+        <w:t>5.5  Testing Summary</w:t>
+      </w:r>
+    </w:p>
+    <w:p>
+      <w:pPr/>
+      <w:r>
+        <w:t>The results of both automated feature testing and manual user acceptance testing demonstrate that the Attendance &amp; Workforce Operations Platform meets all core functional requirements defined in Appendix A. All seven automated test cases passed with zero failures across 10 assertions. All 16 UAT test cases produced the expected outcomes across the three user roles.</w:t>
+      </w:r>
+    </w:p>
+    <w:tbl>
+      <w:tblPr>
+        <w:tblStyle w:val="TableGrid"/>
+        <w:tblW w:type="auto" w:w="0"/>
+        <w:tblLook w:firstColumn="1" w:firstRow="1" w:lastColumn="0" w:lastRow="0" w:noHBand="0" w:noVBand="1" w:val="04A0"/>
+      </w:tblPr>
+      <w:tblGrid>
+        <w:gridCol w:w="1728"/>
+        <w:gridCol w:w="1728"/>
+        <w:gridCol w:w="1728"/>
+        <w:gridCol w:w="1728"/>
+        <w:gridCol w:w="1728"/>
+      </w:tblGrid>
+      <w:tr>
+        <w:tc>
+          <w:tcPr>
+            <w:tcW w:type="dxa" w:w="1728"/>
+          </w:tcPr>
+          <w:p>
+            <w:r>
+              <w:rPr>
+                <w:b/>
+              </w:rPr>
+              <w:t>Testing Category</w:t>
+            </w:r>
+          </w:p>
+        </w:tc>
+        <w:tc>
+          <w:tcPr>
+            <w:tcW w:type="dxa" w:w="1728"/>
+          </w:tcPr>
+          <w:p>
+            <w:r>
+              <w:rPr>
+                <w:b/>
+              </w:rPr>
+              <w:t>Total Cases</w:t>
+            </w:r>
+          </w:p>
+        </w:tc>
+        <w:tc>
+          <w:tcPr>
+            <w:tcW w:type="dxa" w:w="1728"/>
+          </w:tcPr>
+          <w:p>
+            <w:r>
+              <w:rPr>
+                <w:b/>
+              </w:rPr>
+              <w:t>Passed</w:t>
+            </w:r>
+          </w:p>
+        </w:tc>
+        <w:tc>
+          <w:tcPr>
+            <w:tcW w:type="dxa" w:w="1728"/>
+          </w:tcPr>
+          <w:p>
+            <w:r>
+              <w:rPr>
+                <w:b/>
+              </w:rPr>
+              <w:t>Failed</w:t>
+            </w:r>
+          </w:p>
+        </w:tc>
+        <w:tc>
+          <w:tcPr>
+            <w:tcW w:type="dxa" w:w="1728"/>
+          </w:tcPr>
+          <w:p>
+            <w:r>
+              <w:rPr>
+                <w:b/>
+              </w:rPr>
+              <w:t>Pass Rate</w:t>
+            </w:r>
+          </w:p>
+        </w:tc>
+      </w:tr>
+      <w:tr>
+        <w:tc>
+          <w:tcPr>
+            <w:tcW w:type="dxa" w:w="1728"/>
+          </w:tcPr>
+          <w:p/>
+        </w:tc>
+        <w:tc>
+          <w:tcPr>
+            <w:tcW w:type="dxa" w:w="1728"/>
+          </w:tcPr>
+          <w:p/>
+        </w:tc>
+        <w:tc>
+          <w:tcPr>
+            <w:tcW w:type="dxa" w:w="1728"/>
+          </w:tcPr>
+          <w:p/>
+        </w:tc>
+        <w:tc>
+          <w:tcPr>
+            <w:tcW w:type="dxa" w:w="1728"/>
+          </w:tcPr>
+          <w:p/>
+        </w:tc>
+        <w:tc>
+          <w:tcPr>
+            <w:tcW w:type="dxa" w:w="1728"/>
+          </w:tcPr>
+          <w:p/>
+        </w:tc>
+      </w:tr>
+      <w:tr>
+        <w:tc>
+          <w:tcPr>
+            <w:tcW w:type="dxa" w:w="1728"/>
+          </w:tcPr>
+          <w:p/>
+        </w:tc>
+        <w:tc>
+          <w:tcPr>
+            <w:tcW w:type="dxa" w:w="1728"/>
+          </w:tcPr>
+          <w:p/>
+        </w:tc>
+        <w:tc>
+          <w:tcPr>
+            <w:tcW w:type="dxa" w:w="1728"/>
+          </w:tcPr>
+          <w:p/>
+        </w:tc>
+        <w:tc>
+          <w:tcPr>
+            <w:tcW w:type="dxa" w:w="1728"/>
+          </w:tcPr>
+          <w:p/>
+        </w:tc>
+        <w:tc>
+          <w:tcPr>
+            <w:tcW w:type="dxa" w:w="1728"/>
+          </w:tcPr>
+          <w:p/>
+        </w:tc>
+      </w:tr>
+      <w:tr>
+        <w:tc>
+          <w:tcPr>
+            <w:tcW w:type="dxa" w:w="1728"/>
+          </w:tcPr>
+          <w:p/>
+        </w:tc>
+        <w:tc>
+          <w:tcPr>
+            <w:tcW w:type="dxa" w:w="1728"/>
+          </w:tcPr>
+          <w:p/>
+        </w:tc>
+        <w:tc>
+          <w:tcPr>
+            <w:tcW w:type="dxa" w:w="1728"/>
+          </w:tcPr>
+          <w:p/>
+        </w:tc>
+        <w:tc>
+          <w:tcPr>
+            <w:tcW w:type="dxa" w:w="1728"/>
+          </w:tcPr>
+          <w:p/>
+        </w:tc>
+        <w:tc>
+          <w:tcPr>
+            <w:tcW w:type="dxa" w:w="1728"/>
+          </w:tcPr>
+          <w:p/>
+        </w:tc>
+      </w:tr>
+      <w:tr>
+        <w:tc>
+          <w:tcPr>
+            <w:tcW w:type="dxa" w:w="1728"/>
+          </w:tcPr>
+          <w:p/>
+        </w:tc>
+        <w:tc>
+          <w:tcPr>
+            <w:tcW w:type="dxa" w:w="1728"/>
+          </w:tcPr>
+          <w:p/>
+        </w:tc>
+        <w:tc>
+          <w:tcPr>
+            <w:tcW w:type="dxa" w:w="1728"/>
+          </w:tcPr>
+          <w:p/>
+        </w:tc>
+        <w:tc>
+          <w:tcPr>
+            <w:tcW w:type="dxa" w:w="1728"/>
+          </w:tcPr>
+          <w:p/>
+        </w:tc>
+        <w:tc>
+          <w:tcPr>
+            <w:tcW w:type="dxa" w:w="1728"/>
+          </w:tcPr>
+          <w:p/>
+        </w:tc>
+      </w:tr>
+      <w:tr>
+        <w:tc>
+          <w:tcPr>
+            <w:tcW w:type="dxa" w:w="1728"/>
+          </w:tcPr>
+          <w:p/>
+        </w:tc>
+        <w:tc>
+          <w:tcPr>
+            <w:tcW w:type="dxa" w:w="1728"/>
+          </w:tcPr>
+          <w:p/>
+        </w:tc>
+        <w:tc>
+          <w:tcPr>
+            <w:tcW w:type="dxa" w:w="1728"/>
+          </w:tcPr>
+          <w:p/>
+        </w:tc>
+        <w:tc>
+          <w:tcPr>
+            <w:tcW w:type="dxa" w:w="1728"/>
+          </w:tcPr>
+          <w:p/>
+        </w:tc>
+        <w:tc>
+          <w:tcPr>
+            <w:tcW w:type="dxa" w:w="1728"/>
+          </w:tcPr>
+          <w:p/>
+        </w:tc>
+      </w:tr>
+      <w:tr>
+        <w:tc>
+          <w:tcPr>
+            <w:tcW w:type="dxa" w:w="1728"/>
+          </w:tcPr>
+          <w:p>
+            <w:r>
+              <w:t>Automated Feature Tests (PHPUnit)</w:t>
+            </w:r>
+          </w:p>
+        </w:tc>
+        <w:tc>
+          <w:tcPr>
+            <w:tcW w:type="dxa" w:w="1728"/>
+          </w:tcPr>
+          <w:p>
+            <w:r>
+              <w:t>7</w:t>
+            </w:r>
+          </w:p>
+        </w:tc>
+        <w:tc>
+          <w:tcPr>
+            <w:tcW w:type="dxa" w:w="1728"/>
+          </w:tcPr>
+          <w:p>
+            <w:r>
+              <w:t>7</w:t>
+            </w:r>
+          </w:p>
+        </w:tc>
+        <w:tc>
+          <w:tcPr>
+            <w:tcW w:type="dxa" w:w="1728"/>
+          </w:tcPr>
+          <w:p>
+            <w:r>
+              <w:t>0</w:t>
+            </w:r>
+          </w:p>
+        </w:tc>
+        <w:tc>
+          <w:tcPr>
+            <w:tcW w:type="dxa" w:w="1728"/>
+          </w:tcPr>
+          <w:p>
+            <w:r>
+              <w:t>100%</w:t>
+            </w:r>
+          </w:p>
+        </w:tc>
+      </w:tr>
+      <w:tr>
+        <w:tc>
+          <w:tcPr>
+            <w:tcW w:type="dxa" w:w="1728"/>
+          </w:tcPr>
+          <w:p>
+            <w:r>
+              <w:t>UAT – Staff Role</w:t>
+            </w:r>
+          </w:p>
+        </w:tc>
+        <w:tc>
+          <w:tcPr>
+            <w:tcW w:type="dxa" w:w="1728"/>
+          </w:tcPr>
+          <w:p>
+            <w:r>
+              <w:t>6</w:t>
+            </w:r>
+          </w:p>
+        </w:tc>
+        <w:tc>
+          <w:tcPr>
+            <w:tcW w:type="dxa" w:w="1728"/>
+          </w:tcPr>
+          <w:p>
+            <w:r>
+              <w:t>6</w:t>
+            </w:r>
+          </w:p>
+        </w:tc>
+        <w:tc>
+          <w:tcPr>
+            <w:tcW w:type="dxa" w:w="1728"/>
+          </w:tcPr>
+          <w:p>
+            <w:r>
+              <w:t>0</w:t>
+            </w:r>
+          </w:p>
+        </w:tc>
+        <w:tc>
+          <w:tcPr>
+            <w:tcW w:type="dxa" w:w="1728"/>
+          </w:tcPr>
+          <w:p>
+            <w:r>
+              <w:t>100%</w:t>
+            </w:r>
+          </w:p>
+        </w:tc>
+      </w:tr>
+      <w:tr>
+        <w:tc>
+          <w:tcPr>
+            <w:tcW w:type="dxa" w:w="1728"/>
+          </w:tcPr>
+          <w:p>
+            <w:r>
+              <w:t>UAT – Manager Role</w:t>
+            </w:r>
+          </w:p>
+        </w:tc>
+        <w:tc>
+          <w:tcPr>
+            <w:tcW w:type="dxa" w:w="1728"/>
+          </w:tcPr>
+          <w:p>
+            <w:r>
+              <w:t>4</w:t>
+            </w:r>
+          </w:p>
+        </w:tc>
+        <w:tc>
+          <w:tcPr>
+            <w:tcW w:type="dxa" w:w="1728"/>
+          </w:tcPr>
+          <w:p>
+            <w:r>
+              <w:t>4</w:t>
+            </w:r>
+          </w:p>
+        </w:tc>
+        <w:tc>
+          <w:tcPr>
+            <w:tcW w:type="dxa" w:w="1728"/>
+          </w:tcPr>
+          <w:p>
+            <w:r>
+              <w:t>0</w:t>
+            </w:r>
+          </w:p>
+        </w:tc>
+        <w:tc>
+          <w:tcPr>
+            <w:tcW w:type="dxa" w:w="1728"/>
+          </w:tcPr>
+          <w:p>
+            <w:r>
+              <w:t>100%</w:t>
+            </w:r>
+          </w:p>
+        </w:tc>
+      </w:tr>
+      <w:tr>
+        <w:tc>
+          <w:tcPr>
+            <w:tcW w:type="dxa" w:w="1728"/>
+          </w:tcPr>
+          <w:p>
+            <w:r>
+              <w:t>UAT – Admin Role</w:t>
+            </w:r>
+          </w:p>
+        </w:tc>
+        <w:tc>
+          <w:tcPr>
+            <w:tcW w:type="dxa" w:w="1728"/>
+          </w:tcPr>
+          <w:p>
+            <w:r>
+              <w:t>6</w:t>
+            </w:r>
+          </w:p>
+        </w:tc>
+        <w:tc>
+          <w:tcPr>
+            <w:tcW w:type="dxa" w:w="1728"/>
+          </w:tcPr>
+          <w:p>
+            <w:r>
+              <w:t>6</w:t>
+            </w:r>
+          </w:p>
+        </w:tc>
+        <w:tc>
+          <w:tcPr>
+            <w:tcW w:type="dxa" w:w="1728"/>
+          </w:tcPr>
+          <w:p>
+            <w:r>
+              <w:t>0</w:t>
+            </w:r>
+          </w:p>
+        </w:tc>
+        <w:tc>
+          <w:tcPr>
+            <w:tcW w:type="dxa" w:w="1728"/>
+          </w:tcPr>
+          <w:p>
+            <w:r>
+              <w:t>100%</w:t>
+            </w:r>
+          </w:p>
+        </w:tc>
+      </w:tr>
+      <w:tr>
+        <w:tc>
+          <w:tcPr>
+            <w:tcW w:type="dxa" w:w="1728"/>
+          </w:tcPr>
+          <w:p>
+            <w:r>
+              <w:t>Overall</w:t>
+            </w:r>
+          </w:p>
+        </w:tc>
+        <w:tc>
+          <w:tcPr>
+            <w:tcW w:type="dxa" w:w="1728"/>
+          </w:tcPr>
+          <w:p>
+            <w:r>
+              <w:t>23</w:t>
+            </w:r>
+          </w:p>
+        </w:tc>
+        <w:tc>
+          <w:tcPr>
+            <w:tcW w:type="dxa" w:w="1728"/>
+          </w:tcPr>
+          <w:p>
+            <w:r>
+              <w:t>23</w:t>
+            </w:r>
+          </w:p>
+        </w:tc>
+        <w:tc>
+          <w:tcPr>
+            <w:tcW w:type="dxa" w:w="1728"/>
+          </w:tcPr>
+          <w:p>
+            <w:r>
+              <w:t>0</w:t>
+            </w:r>
+          </w:p>
+        </w:tc>
+        <w:tc>
+          <w:tcPr>
+            <w:tcW w:type="dxa" w:w="1728"/>
+          </w:tcPr>
+          <w:p>
+            <w:r>
+              <w:t>100%</w:t>
+            </w:r>
+          </w:p>
+        </w:tc>
+      </w:tr>
+    </w:tbl>
+    <w:p/>
+    <w:p>
+      <w:pPr/>
+      <w:r>
+        <w:t>No critical defects were identified. Role-based access control correctly restricts each user to their authorised panel. Attendance verification logic produces consistent results for GPS-verified and IP-verified records. Shift-window and overtime calculations are mathematically accurate as confirmed by the automated assertions. Vehicle service alerts fire correctly at the 500-km-remaining threshold.</w:t>
+      </w:r>
+    </w:p>
+    <w:p>
+      <w:pPr>
+        <w:pStyle w:val="Heading1"/>
+      </w:pPr>
+      <w:r>
+        <w:t>CHAPTER 6    CONCLUSION AND RECOMMENDATIONS FOR FUTURE WORK</w:t>
+      </w:r>
+    </w:p>
+    <w:p>
+      <w:pPr>
+        <w:pStyle w:val="Heading2"/>
+      </w:pPr>
+      <w:r>
+        <w:t>6.1  Conclusion</w:t>
       </w:r>
     </w:p>
     <w:p>

</xml_diff>